<commit_message>
📰 Atualiza boletim - 2026-07-06
</commit_message>
<xml_diff>
--- a/output/boletim_ambiental.docx
+++ b/output/boletim_ambiental.docx
@@ -52,7 +52,7 @@
                 <w:color w:val="FFFFFF"/>
                 <w:sz w:val="28"/>
               </w:rPr>
-              <w:t>3 de julho de 2026</w:t>
+              <w:t>6 de julho de 2026</w:t>
             </w:r>
           </w:p>
         </w:tc>
@@ -87,7 +87,7 @@
                 <w:color w:val="1A4D2E"/>
                 <w:sz w:val="56"/>
               </w:rPr>
-              <w:t>45</w:t>
+              <w:t>37</w:t>
             </w:r>
           </w:p>
         </w:tc>
@@ -106,7 +106,7 @@
                 <w:color w:val="C0392B"/>
                 <w:sz w:val="56"/>
               </w:rPr>
-              <w:t>22</w:t>
+              <w:t>11</w:t>
             </w:r>
           </w:p>
         </w:tc>
@@ -125,7 +125,7 @@
                 <w:color w:val="D68910"/>
                 <w:sz w:val="56"/>
               </w:rPr>
-              <w:t>21</w:t>
+              <w:t>13</w:t>
             </w:r>
           </w:p>
         </w:tc>
@@ -144,7 +144,7 @@
                 <w:color w:val="7F8C8D"/>
                 <w:sz w:val="56"/>
               </w:rPr>
-              <w:t>2</w:t>
+              <w:t>13</w:t>
             </w:r>
           </w:p>
         </w:tc>
@@ -346,7 +346,7 @@
                   <w:u w:val="single"/>
                   <w:b/>
                 </w:rPr>
-                <w:t>Lei nº 15.455, de 1º.7.2026</w:t>
+                <w:t>Lei nº 15.458, de 3.7.2026 - Abre crédito extraordinário em favor do Ministério da Integração e do Desenvolvimento Regional, no valor de R$ 266.512.000,00 (duzentos e sessenta e seis milhões quinhentos e doze mil reais), para os fins que especifica.</w:t>
               </w:r>
             </w:hyperlink>
           </w:p>
@@ -359,7 +359,7 @@
                 <w:color w:val="4A4A4A"/>
                 <w:sz w:val="18"/>
               </w:rPr>
-              <w:t>Estabelece medidas de proteção e acolhimento de trabalhadores resgatados de condição análoga à de escravo. Altera o Código Penal e outras leis para incluir disposições referentes ao combate a essa prática.</w:t>
+              <w:t>Abre crédito extraordinário para o Ministério da Integração e do Desenvolvimento Regional, no valor de R$ 266.512.000,00.</w:t>
             </w:r>
           </w:p>
         </w:tc>
@@ -404,7 +404,7 @@
                   <w:u w:val="single"/>
                   <w:b/>
                 </w:rPr>
-                <w:t>Lei Complementar nº 233, de 1º.7.2026</w:t>
+                <w:t>Medida Provisória nº 1.375, de 3.7.2026 - Amplia o rol de Carreiras e Planos Especiais de Cargos cujos ocupantes fazem jus à indenização de que trata a Lei nº 12.855, de 2 de setembro de 2013, altera a Lei nº 15.367, de 30 de março de 2026, para admitir que as pessoas de que tratam o art. 6º da Emenda Constitucional nº 79, de 27 de maio de 2014, e o art. 6º da Emenda Constitucional nº 98, de 6 de dezembro de 2017, exerçam o direito de opção de que tratam os art. 52 a art. 54 da referida Lei, e transforma cargos efetivos vagos.</w:t>
               </w:r>
             </w:hyperlink>
           </w:p>
@@ -417,7 +417,7 @@
                 <w:color w:val="4A4A4A"/>
                 <w:sz w:val="18"/>
               </w:rPr>
-              <w:t>Altera a Lei Complementar nº 79/1994 para destinar recursos do Fundo Penitenciário Nacional (Funpen) à formação e capacitação continuada de servidores do sistema penitenciário e policiais penais.</w:t>
+              <w:t>MP amplia rol de carreiras com direito a indenização, altera leis sobre opção de cargos e transforma cargos vagos.</w:t>
             </w:r>
           </w:p>
         </w:tc>
@@ -448,7 +448,7 @@
                 <w:color w:val="1A4D2E"/>
                 <w:sz w:val="16"/>
               </w:rPr>
-              <w:t>MME | NOTÍCIAS</w:t>
+              <w:t>PLANALTO | RESENHA DIARIA</w:t>
             </w:r>
           </w:p>
           <w:p>
@@ -462,7 +462,7 @@
                   <w:u w:val="single"/>
                   <w:b/>
                 </w:rPr>
-                <w:t>Primeiro caderno do PDE 2036 reúne contexto, perspectivas e premissas para o setor energético</w:t>
+                <w:t>Decreto nº 13.054, de 3.7.2026 - Altera o Regulamento da Previdência Social, aprovado pelo Decreto nº 3.048, de 6 de maio de 1999, para dispor sobre a condição de segurado especial dos associados em cooperativas.</w:t>
               </w:r>
             </w:hyperlink>
           </w:p>
@@ -475,7 +475,7 @@
                 <w:color w:val="4A4A4A"/>
                 <w:sz w:val="18"/>
               </w:rPr>
-              <w:t>MME publica o primeiro caderno do Plano Decenal de Expansão de Energia (PDE 2036), com bases para o planejamento estratégico do setor energético.</w:t>
+              <w:t>Altera o Regulamento da Previdência Social para incluir associados em cooperativas como segurados especiais.</w:t>
             </w:r>
           </w:p>
         </w:tc>
@@ -506,7 +506,7 @@
                 <w:color w:val="1A4D2E"/>
                 <w:sz w:val="16"/>
               </w:rPr>
-              <w:t>MME | NOTÍCIAS</w:t>
+              <w:t>PLANALTO | RESENHA DIARIA</w:t>
             </w:r>
           </w:p>
           <w:p>
@@ -520,7 +520,7 @@
                   <w:u w:val="single"/>
                   <w:b/>
                 </w:rPr>
-                <w:t>MME fortalece agenda regulatória com 200 atos normativos elaborados pela SNPGB</w:t>
+                <w:t>Decreto nº 13.052, de 3.7.2026 - Altera o Decreto nº 11.002, de 17 de março de 2022, que regulamenta a Lei nº 13.954, de 16 de dezembro de 2019, e a Medida Provisória nº 2.215-10, de 31 de agosto de 2001, para dispor sobre a remuneração dos militares na ativa, os proventos na inatividade e as pensões militares.</w:t>
               </w:r>
             </w:hyperlink>
           </w:p>
@@ -533,7 +533,7 @@
                 <w:color w:val="4A4A4A"/>
                 <w:sz w:val="18"/>
               </w:rPr>
-              <w:t>MME fortalece sua agenda regulatória com a elaboração de 200 atos normativos pela SNPGB, visando modernizar o ambiente, ampliar segurança jurídica e impulsionar o setor energético.</w:t>
+              <w:t>Altera decreto sobre remuneração, proventos e pensões de militares na ativa e inatividade.</w:t>
             </w:r>
           </w:p>
         </w:tc>
@@ -564,7 +564,7 @@
                 <w:color w:val="1A4D2E"/>
                 <w:sz w:val="16"/>
               </w:rPr>
-              <w:t>MME | NOTÍCIAS</w:t>
+              <w:t>PLANALTO | RESENHA DIARIA</w:t>
             </w:r>
           </w:p>
           <w:p>
@@ -578,7 +578,7 @@
                   <w:u w:val="single"/>
                   <w:b/>
                 </w:rPr>
-                <w:t>Projeto Piraquê fortalece sistema elétrico e amplia escoamento de energia solar em Minas Gerais e no Espírito Santo</w:t>
+                <w:t>Decreto nº 13.050, de 3.7.2026 - Altera o Decreto nº 9.226, de 6 de dezembro de 2017, que regulamenta a Lei nº 12.855, de 2 de setembro de 2013, que institui a indenização devida a ocupante de cargo efetivo das Carreiras e Planos Especiais de Cargos que especifica, em exercício nas unidades situadas em localidades estratégicas vinculadas à prevenção, controle, fiscalização e repressão dos delitos transfronteiriços.</w:t>
               </w:r>
             </w:hyperlink>
           </w:p>
@@ -591,7 +591,7 @@
                 <w:color w:val="4A4A4A"/>
                 <w:sz w:val="18"/>
               </w:rPr>
-              <w:t>Projeto Piraquê, com R$ 3,65 bilhões em investimentos, adiciona 1.140 km de linhas, fortalecendo o sistema elétrico e escoamento de energia solar em MG e ES.</w:t>
+              <w:t>Altera decreto sobre indenização a servidores em localidades estratégicas de combate a delitos transfronteiriços.</w:t>
             </w:r>
           </w:p>
         </w:tc>
@@ -660,7 +660,7 @@
           <w:color w:val="1A1A1A"/>
           <w:sz w:val="22"/>
         </w:rPr>
-        <w:t xml:space="preserve">Lei nº 15.455, de 1º.7.2026   </w:t>
+        <w:t xml:space="preserve">Lei nº 15.458, de 3.7.2026 - Abre crédito extraordinário em favor do Ministério da Integração e do Desenvolvimento Regional, no valor de R$ 266.512.000,00 (duzentos e sessenta e seis milhões quinhentos e doze mil reais), para os fins que especifica.   </w:t>
       </w:r>
       <w:r>
         <w:rPr>
@@ -680,7 +680,7 @@
           <w:color w:val="4A4A4A"/>
           <w:sz w:val="20"/>
         </w:rPr>
-        <w:t>Estabelece medidas de proteção e acolhimento de trabalhadores resgatados de condição análoga à de escravo. Altera o Código Penal e outras leis para incluir disposições referentes ao combate a essa prática.</w:t>
+        <w:t>Abre crédito extraordinário para o Ministério da Integração e do Desenvolvimento Regional, no valor de R$ 266.512.000,00.</w:t>
       </w:r>
     </w:p>
     <w:p>
@@ -700,7 +700,7 @@
           <w:color w:val="888888"/>
           <w:sz w:val="18"/>
         </w:rPr>
-        <w:t xml:space="preserve">2026-07-02   </w:t>
+        <w:t xml:space="preserve">2026-07-06   </w:t>
       </w:r>
       <w:hyperlink r:id="rId9">
         <w:r>
@@ -723,7 +723,7 @@
           <w:color w:val="888888"/>
           <w:sz w:val="16"/>
         </w:rPr>
-        <w:t>Nova legislação com impacto social e jurídico significativo, alterando leis importantes para o combate ao trabalho análogo à escravidão.</w:t>
+        <w:t>Legislação federal com impacto orçamentário significativo.</w:t>
       </w:r>
     </w:p>
     <w:p>
@@ -736,15 +736,15 @@
           <w:color w:val="1A1A1A"/>
           <w:sz w:val="22"/>
         </w:rPr>
-        <w:t xml:space="preserve">Lei Complementar nº 233, de 1º.7.2026   </w:t>
+        <w:t xml:space="preserve">Decreto nº 13.055, de 3.7.2026 - Altera o Decreto nº 11.712, de 20 de setembro de 2023, que qualifica organizações militares da Marinha como Organizações Militares Prestadoras de Serviços, com autonomia de gestão.   </w:t>
       </w:r>
       <w:r>
         <w:rPr>
           <w:b/>
-          <w:color w:val="C0392B"/>
+          <w:color w:val="D68910"/>
           <w:sz w:val="16"/>
         </w:rPr>
-        <w:t>[ALTA]</w:t>
+        <w:t>[MÉDIA]</w:t>
       </w:r>
     </w:p>
     <w:p>
@@ -756,7 +756,7 @@
           <w:color w:val="4A4A4A"/>
           <w:sz w:val="20"/>
         </w:rPr>
-        <w:t>Altera a Lei Complementar nº 79/1994 para destinar recursos do Fundo Penitenciário Nacional (Funpen) à formação e capacitação continuada de servidores do sistema penitenciário e policiais penais.</w:t>
+        <w:t>Altera decreto que qualifica organizações militares da Marinha como prestadoras de serviços com autonomia de gestão.</w:t>
       </w:r>
     </w:p>
     <w:p>
@@ -776,7 +776,83 @@
           <w:color w:val="888888"/>
           <w:sz w:val="18"/>
         </w:rPr>
-        <w:t xml:space="preserve">2026-07-02   </w:t>
+        <w:t xml:space="preserve">2026-07-06   </w:t>
+      </w:r>
+      <w:hyperlink r:id="rId14">
+        <w:r>
+          <w:rPr>
+            <w:color w:val="1A4D2E"/>
+            <w:u w:val="single"/>
+            <w:b/>
+          </w:rPr>
+          <w:t>Acessar materia</w:t>
+        </w:r>
+      </w:hyperlink>
+    </w:p>
+    <w:p>
+      <w:pPr>
+        <w:spacing w:after="120"/>
+      </w:pPr>
+      <w:r>
+        <w:rPr>
+          <w:i/>
+          <w:color w:val="888888"/>
+          <w:sz w:val="16"/>
+        </w:rPr>
+        <w:t>Ato administrativo que impacta a gestão de órgãos públicos.</w:t>
+      </w:r>
+    </w:p>
+    <w:p>
+      <w:pPr>
+        <w:spacing w:before="160" w:after="40"/>
+      </w:pPr>
+      <w:r>
+        <w:rPr>
+          <w:b/>
+          <w:color w:val="1A1A1A"/>
+          <w:sz w:val="22"/>
+        </w:rPr>
+        <w:t xml:space="preserve">Medida Provisória nº 1.375, de 3.7.2026 - Amplia o rol de Carreiras e Planos Especiais de Cargos cujos ocupantes fazem jus à indenização de que trata a Lei nº 12.855, de 2 de setembro de 2013, altera a Lei nº 15.367, de 30 de março de 2026, para admitir que as pessoas de que tratam o art. 6º da Emenda Constitucional nº 79, de 27 de maio de 2014, e o art. 6º da Emenda Constitucional nº 98, de 6 de dezembro de 2017, exerçam o direito de opção de que tratam os art. 52 a art. 54 da referida Lei, e transforma cargos efetivos vagos.   </w:t>
+      </w:r>
+      <w:r>
+        <w:rPr>
+          <w:b/>
+          <w:color w:val="C0392B"/>
+          <w:sz w:val="16"/>
+        </w:rPr>
+        <w:t>[ALTA]</w:t>
+      </w:r>
+    </w:p>
+    <w:p>
+      <w:pPr>
+        <w:spacing w:after="40"/>
+      </w:pPr>
+      <w:r>
+        <w:rPr>
+          <w:color w:val="4A4A4A"/>
+          <w:sz w:val="20"/>
+        </w:rPr>
+        <w:t>MP amplia rol de carreiras com direito a indenização, altera leis sobre opção de cargos e transforma cargos vagos.</w:t>
+      </w:r>
+    </w:p>
+    <w:p>
+      <w:pPr>
+        <w:spacing w:after="40"/>
+      </w:pPr>
+      <w:r>
+        <w:rPr>
+          <w:b/>
+          <w:color w:val="888888"/>
+          <w:sz w:val="18"/>
+        </w:rPr>
+        <w:t xml:space="preserve">Publicado: </w:t>
+      </w:r>
+      <w:r>
+        <w:rPr>
+          <w:color w:val="888888"/>
+          <w:sz w:val="18"/>
+        </w:rPr>
+        <w:t xml:space="preserve">2026-07-03   </w:t>
       </w:r>
       <w:hyperlink r:id="rId10">
         <w:r>
@@ -799,7 +875,7 @@
           <w:color w:val="888888"/>
           <w:sz w:val="16"/>
         </w:rPr>
-        <w:t>Altera lei complementar, impactando diretamente o financiamento e a capacitação de profissionais do sistema penitenciário e policiais penais.</w:t>
+        <w:t>Legislação federal com impacto em carreiras e planos de cargos públicos.</w:t>
       </w:r>
     </w:p>
     <w:p>
@@ -812,15 +888,15 @@
           <w:color w:val="1A1A1A"/>
           <w:sz w:val="22"/>
         </w:rPr>
-        <w:t xml:space="preserve">Decreto nº 13.047, de 1º.7.2026   </w:t>
+        <w:t xml:space="preserve">Decreto nº 13.054, de 3.7.2026 - Altera o Regulamento da Previdência Social, aprovado pelo Decreto nº 3.048, de 6 de maio de 1999, para dispor sobre a condição de segurado especial dos associados em cooperativas.   </w:t>
       </w:r>
       <w:r>
         <w:rPr>
           <w:b/>
-          <w:color w:val="D68910"/>
+          <w:color w:val="C0392B"/>
           <w:sz w:val="16"/>
         </w:rPr>
-        <w:t>[MÉDIA]</w:t>
+        <w:t>[ALTA]</w:t>
       </w:r>
     </w:p>
     <w:p>
@@ -832,7 +908,7 @@
           <w:color w:val="4A4A4A"/>
           <w:sz w:val="20"/>
         </w:rPr>
-        <w:t>Promulga o Acordo para a Proteção de Informação Classificada entre Brasil e Portugal, firmado em 2005, visando a proteção mútua de dados sensíveis.</w:t>
+        <w:t>Altera o Regulamento da Previdência Social para incluir associados em cooperativas como segurados especiais.</w:t>
       </w:r>
     </w:p>
     <w:p>
@@ -852,9 +928,9 @@
           <w:color w:val="888888"/>
           <w:sz w:val="18"/>
         </w:rPr>
-        <w:t xml:space="preserve">2026-07-02   </w:t>
+        <w:t xml:space="preserve">2026-07-03   </w:t>
       </w:r>
-      <w:hyperlink r:id="rId14">
+      <w:hyperlink r:id="rId11">
         <w:r>
           <w:rPr>
             <w:color w:val="1A4D2E"/>
@@ -875,7 +951,7 @@
           <w:color w:val="888888"/>
           <w:sz w:val="16"/>
         </w:rPr>
-        <w:t>Promulgação de acordo internacional que afeta a proteção de informações classificadas entre países.</w:t>
+        <w:t>Legislação federal com impacto direto na previdência social e cooperativas.</w:t>
       </w:r>
     </w:p>
     <w:p>
@@ -888,7 +964,7 @@
           <w:color w:val="1A1A1A"/>
           <w:sz w:val="22"/>
         </w:rPr>
-        <w:t xml:space="preserve">Decreto nº 13.046, de 1º.7.2026   </w:t>
+        <w:t xml:space="preserve">Decreto nº 13.053, de 3.7.2026 - Altera o Decreto nº 11.329, de 1º de janeiro de 2023, que aprova a Estrutura Regimental e o Quadro Demonstrativo dos Cargos em Comissão, das Funções de Confiança e das Gratificações da Casa Civil da Presidência da República e remaneja e transforma cargos em comissão, funções de confiança e gratificações.   </w:t>
       </w:r>
       <w:r>
         <w:rPr>
@@ -908,7 +984,7 @@
           <w:color w:val="4A4A4A"/>
           <w:sz w:val="20"/>
         </w:rPr>
-        <w:t>Promulga o Acordo entre Brasil e Eslovênia sobre a Troca e Proteção Mútua de Informações Classificadas, firmado em 2023, reforçando a segurança de dados entre as nações.</w:t>
+        <w:t>Altera estrutura regimental e quadro de cargos da Casa Civil da Presidência da República.</w:t>
       </w:r>
     </w:p>
     <w:p>
@@ -928,7 +1004,7 @@
           <w:color w:val="888888"/>
           <w:sz w:val="18"/>
         </w:rPr>
-        <w:t xml:space="preserve">2026-07-02   </w:t>
+        <w:t xml:space="preserve">2026-07-03   </w:t>
       </w:r>
       <w:hyperlink r:id="rId15">
         <w:r>
@@ -951,7 +1027,7 @@
           <w:color w:val="888888"/>
           <w:sz w:val="16"/>
         </w:rPr>
-        <w:t>Promulgação de acordo internacional que afeta a proteção de informações classificadas entre países.</w:t>
+        <w:t>Ato administrativo que reorganiza a estrutura de cargos na administração pública.</w:t>
       </w:r>
     </w:p>
     <w:p>
@@ -964,15 +1040,15 @@
           <w:color w:val="1A1A1A"/>
           <w:sz w:val="22"/>
         </w:rPr>
-        <w:t xml:space="preserve">Lei nº 15.454, de 1º.7.2026   </w:t>
+        <w:t xml:space="preserve">Decreto nº 13.052, de 3.7.2026 - Altera o Decreto nº 11.002, de 17 de março de 2022, que regulamenta a Lei nº 13.954, de 16 de dezembro de 2019, e a Medida Provisória nº 2.215-10, de 31 de agosto de 2001, para dispor sobre a remuneração dos militares na ativa, os proventos na inatividade e as pensões militares.   </w:t>
       </w:r>
       <w:r>
         <w:rPr>
           <w:b/>
-          <w:color w:val="7F8C8D"/>
+          <w:color w:val="C0392B"/>
           <w:sz w:val="16"/>
         </w:rPr>
-        <w:t>[BAIXA]</w:t>
+        <w:t>[ALTA]</w:t>
       </w:r>
     </w:p>
     <w:p>
@@ -984,7 +1060,7 @@
           <w:color w:val="4A4A4A"/>
           <w:sz w:val="20"/>
         </w:rPr>
-        <w:t>Dispõe sobre a transferência simbólica da sede do governo federal para Salvador, Bahia, em 2 de julho de cada ano, em caráter comemorativo.</w:t>
+        <w:t>Altera decreto sobre remuneração, proventos e pensões de militares na ativa e inatividade.</w:t>
       </w:r>
     </w:p>
     <w:p>
@@ -1004,7 +1080,83 @@
           <w:color w:val="888888"/>
           <w:sz w:val="18"/>
         </w:rPr>
-        <w:t xml:space="preserve">2026-07-02   </w:t>
+        <w:t xml:space="preserve">2026-07-03   </w:t>
+      </w:r>
+      <w:hyperlink r:id="rId12">
+        <w:r>
+          <w:rPr>
+            <w:color w:val="1A4D2E"/>
+            <w:u w:val="single"/>
+            <w:b/>
+          </w:rPr>
+          <w:t>Acessar materia</w:t>
+        </w:r>
+      </w:hyperlink>
+    </w:p>
+    <w:p>
+      <w:pPr>
+        <w:spacing w:after="120"/>
+      </w:pPr>
+      <w:r>
+        <w:rPr>
+          <w:i/>
+          <w:color w:val="888888"/>
+          <w:sz w:val="16"/>
+        </w:rPr>
+        <w:t>Legislação federal com impacto direto em direitos e remuneração de militares.</w:t>
+      </w:r>
+    </w:p>
+    <w:p>
+      <w:pPr>
+        <w:spacing w:before="160" w:after="40"/>
+      </w:pPr>
+      <w:r>
+        <w:rPr>
+          <w:b/>
+          <w:color w:val="1A1A1A"/>
+          <w:sz w:val="22"/>
+        </w:rPr>
+        <w:t xml:space="preserve">Decreto nº 13.051, de 3.7.2026 - Dispõe sobre a distribuição do quantitativo de Gratificação Temporária de Execução e Apoio a Atividades Técnicas e Administrativas – GTATA.   </w:t>
+      </w:r>
+      <w:r>
+        <w:rPr>
+          <w:b/>
+          <w:color w:val="D68910"/>
+          <w:sz w:val="16"/>
+        </w:rPr>
+        <w:t>[MÉDIA]</w:t>
+      </w:r>
+    </w:p>
+    <w:p>
+      <w:pPr>
+        <w:spacing w:after="40"/>
+      </w:pPr>
+      <w:r>
+        <w:rPr>
+          <w:color w:val="4A4A4A"/>
+          <w:sz w:val="20"/>
+        </w:rPr>
+        <w:t>Dispõe sobre a distribuição de Gratificação Temporária para atividades técnicas e administrativas (GTATA).</w:t>
+      </w:r>
+    </w:p>
+    <w:p>
+      <w:pPr>
+        <w:spacing w:after="40"/>
+      </w:pPr>
+      <w:r>
+        <w:rPr>
+          <w:b/>
+          <w:color w:val="888888"/>
+          <w:sz w:val="18"/>
+        </w:rPr>
+        <w:t xml:space="preserve">Publicado: </w:t>
+      </w:r>
+      <w:r>
+        <w:rPr>
+          <w:color w:val="888888"/>
+          <w:sz w:val="18"/>
+        </w:rPr>
+        <w:t xml:space="preserve">2026-07-03   </w:t>
       </w:r>
       <w:hyperlink r:id="rId16">
         <w:r>
@@ -1027,7 +1179,387 @@
           <w:color w:val="888888"/>
           <w:sz w:val="16"/>
         </w:rPr>
-        <w:t>Ato de caráter simbólico e institucional, sem impacto regulatório ou econômico direto.</w:t>
+        <w:t>Ato administrativo que impacta a remuneração de servidores.</w:t>
+      </w:r>
+    </w:p>
+    <w:p>
+      <w:pPr>
+        <w:spacing w:before="160" w:after="40"/>
+      </w:pPr>
+      <w:r>
+        <w:rPr>
+          <w:b/>
+          <w:color w:val="1A1A1A"/>
+          <w:sz w:val="22"/>
+        </w:rPr>
+        <w:t xml:space="preserve">Decreto nº 13.050, de 3.7.2026 - Altera o Decreto nº 9.226, de 6 de dezembro de 2017, que regulamenta a Lei nº 12.855, de 2 de setembro de 2013, que institui a indenização devida a ocupante de cargo efetivo das Carreiras e Planos Especiais de Cargos que especifica, em exercício nas unidades situadas em localidades estratégicas vinculadas à prevenção, controle, fiscalização e repressão dos delitos transfronteiriços.   </w:t>
+      </w:r>
+      <w:r>
+        <w:rPr>
+          <w:b/>
+          <w:color w:val="C0392B"/>
+          <w:sz w:val="16"/>
+        </w:rPr>
+        <w:t>[ALTA]</w:t>
+      </w:r>
+    </w:p>
+    <w:p>
+      <w:pPr>
+        <w:spacing w:after="40"/>
+      </w:pPr>
+      <w:r>
+        <w:rPr>
+          <w:color w:val="4A4A4A"/>
+          <w:sz w:val="20"/>
+        </w:rPr>
+        <w:t>Altera decreto sobre indenização a servidores em localidades estratégicas de combate a delitos transfronteiriços.</w:t>
+      </w:r>
+    </w:p>
+    <w:p>
+      <w:pPr>
+        <w:spacing w:after="40"/>
+      </w:pPr>
+      <w:r>
+        <w:rPr>
+          <w:b/>
+          <w:color w:val="888888"/>
+          <w:sz w:val="18"/>
+        </w:rPr>
+        <w:t xml:space="preserve">Publicado: </w:t>
+      </w:r>
+      <w:r>
+        <w:rPr>
+          <w:color w:val="888888"/>
+          <w:sz w:val="18"/>
+        </w:rPr>
+        <w:t xml:space="preserve">2026-07-03   </w:t>
+      </w:r>
+      <w:hyperlink r:id="rId13">
+        <w:r>
+          <w:rPr>
+            <w:color w:val="1A4D2E"/>
+            <w:u w:val="single"/>
+            <w:b/>
+          </w:rPr>
+          <w:t>Acessar materia</w:t>
+        </w:r>
+      </w:hyperlink>
+    </w:p>
+    <w:p>
+      <w:pPr>
+        <w:spacing w:after="120"/>
+      </w:pPr>
+      <w:r>
+        <w:rPr>
+          <w:i/>
+          <w:color w:val="888888"/>
+          <w:sz w:val="16"/>
+        </w:rPr>
+        <w:t>Legislação federal com impacto em direitos de servidores públicos.</w:t>
+      </w:r>
+    </w:p>
+    <w:p>
+      <w:pPr>
+        <w:spacing w:before="160" w:after="40"/>
+      </w:pPr>
+      <w:r>
+        <w:rPr>
+          <w:b/>
+          <w:color w:val="1A1A1A"/>
+          <w:sz w:val="22"/>
+        </w:rPr>
+        <w:t xml:space="preserve">Decreto nº 13.049, de 3.7.2026 - Regulamenta a Lei nº 12.855, de 2 de setembro de 2013, que institui a indenização devida a ocupante de cargo efetivo das Carreiras e Planos Especiais de Cargos que especifica, em exercício nas unidades situadas em localidades estratégicas vinculadas à prevenção, controle, fiscalização e repressão dos delitos transfronteiriços, quanto às Carreiras e aos Planos de Cargos que especifica.   </w:t>
+      </w:r>
+      <w:r>
+        <w:rPr>
+          <w:b/>
+          <w:color w:val="C0392B"/>
+          <w:sz w:val="16"/>
+        </w:rPr>
+        <w:t>[ALTA]</w:t>
+      </w:r>
+    </w:p>
+    <w:p>
+      <w:pPr>
+        <w:spacing w:after="40"/>
+      </w:pPr>
+      <w:r>
+        <w:rPr>
+          <w:color w:val="4A4A4A"/>
+          <w:sz w:val="20"/>
+        </w:rPr>
+        <w:t>Regulamenta lei sobre indenização a servidores em localidades estratégicas de combate a delitos transfronteiriços.</w:t>
+      </w:r>
+    </w:p>
+    <w:p>
+      <w:pPr>
+        <w:spacing w:after="40"/>
+      </w:pPr>
+      <w:r>
+        <w:rPr>
+          <w:b/>
+          <w:color w:val="888888"/>
+          <w:sz w:val="18"/>
+        </w:rPr>
+        <w:t xml:space="preserve">Publicado: </w:t>
+      </w:r>
+      <w:r>
+        <w:rPr>
+          <w:color w:val="888888"/>
+          <w:sz w:val="18"/>
+        </w:rPr>
+        <w:t xml:space="preserve">2026-07-03   </w:t>
+      </w:r>
+      <w:hyperlink r:id="rId17">
+        <w:r>
+          <w:rPr>
+            <w:color w:val="1A4D2E"/>
+            <w:u w:val="single"/>
+            <w:b/>
+          </w:rPr>
+          <w:t>Acessar materia</w:t>
+        </w:r>
+      </w:hyperlink>
+    </w:p>
+    <w:p>
+      <w:pPr>
+        <w:spacing w:after="120"/>
+      </w:pPr>
+      <w:r>
+        <w:rPr>
+          <w:i/>
+          <w:color w:val="888888"/>
+          <w:sz w:val="16"/>
+        </w:rPr>
+        <w:t>Legislação federal com impacto em direitos de servidores públicos.</w:t>
+      </w:r>
+    </w:p>
+    <w:p>
+      <w:pPr>
+        <w:spacing w:before="160" w:after="40"/>
+      </w:pPr>
+      <w:r>
+        <w:rPr>
+          <w:b/>
+          <w:color w:val="1A1A1A"/>
+          <w:sz w:val="22"/>
+        </w:rPr>
+        <w:t xml:space="preserve">Decreto nº 13.048, de 3.7.2026 - Estabelece os critérios e os procedimentos para a concessão do Reconhecimento de Saberes e Competências aos servidores ocupantes dos cargos do Plano de Carreira dos Cargos Técnico-Administrativos em Educação.   </w:t>
+      </w:r>
+      <w:r>
+        <w:rPr>
+          <w:b/>
+          <w:color w:val="D68910"/>
+          <w:sz w:val="16"/>
+        </w:rPr>
+        <w:t>[MÉDIA]</w:t>
+      </w:r>
+    </w:p>
+    <w:p>
+      <w:pPr>
+        <w:spacing w:after="40"/>
+      </w:pPr>
+      <w:r>
+        <w:rPr>
+          <w:color w:val="4A4A4A"/>
+          <w:sz w:val="20"/>
+        </w:rPr>
+        <w:t>Estabelece critérios para concessão de Reconhecimento de Saberes e Competências a servidores técnico-administrativos em Educação.</w:t>
+      </w:r>
+    </w:p>
+    <w:p>
+      <w:pPr>
+        <w:spacing w:after="40"/>
+      </w:pPr>
+      <w:r>
+        <w:rPr>
+          <w:b/>
+          <w:color w:val="888888"/>
+          <w:sz w:val="18"/>
+        </w:rPr>
+        <w:t xml:space="preserve">Publicado: </w:t>
+      </w:r>
+      <w:r>
+        <w:rPr>
+          <w:color w:val="888888"/>
+          <w:sz w:val="18"/>
+        </w:rPr>
+        <w:t xml:space="preserve">2026-07-03   </w:t>
+      </w:r>
+      <w:hyperlink r:id="rId18">
+        <w:r>
+          <w:rPr>
+            <w:color w:val="1A4D2E"/>
+            <w:u w:val="single"/>
+            <w:b/>
+          </w:rPr>
+          <w:t>Acessar materia</w:t>
+        </w:r>
+      </w:hyperlink>
+    </w:p>
+    <w:p>
+      <w:pPr>
+        <w:spacing w:after="120"/>
+      </w:pPr>
+      <w:r>
+        <w:rPr>
+          <w:i/>
+          <w:color w:val="888888"/>
+          <w:sz w:val="16"/>
+        </w:rPr>
+        <w:t>Ato administrativo que impacta a carreira de servidores públicos.</w:t>
+      </w:r>
+    </w:p>
+    <w:p>
+      <w:pPr>
+        <w:spacing w:before="160" w:after="40"/>
+      </w:pPr>
+      <w:r>
+        <w:rPr>
+          <w:b/>
+          <w:color w:val="1A1A1A"/>
+          <w:sz w:val="22"/>
+        </w:rPr>
+        <w:t xml:space="preserve">Lei nº 15.457, de 3.7.2026 - Cria a Universidade Federal do Esporte.   </w:t>
+      </w:r>
+      <w:r>
+        <w:rPr>
+          <w:b/>
+          <w:color w:val="C0392B"/>
+          <w:sz w:val="16"/>
+        </w:rPr>
+        <w:t>[ALTA]</w:t>
+      </w:r>
+    </w:p>
+    <w:p>
+      <w:pPr>
+        <w:spacing w:after="40"/>
+      </w:pPr>
+      <w:r>
+        <w:rPr>
+          <w:color w:val="4A4A4A"/>
+          <w:sz w:val="20"/>
+        </w:rPr>
+        <w:t>Cria a Universidade Federal do Esporte.</w:t>
+      </w:r>
+    </w:p>
+    <w:p>
+      <w:pPr>
+        <w:spacing w:after="40"/>
+      </w:pPr>
+      <w:r>
+        <w:rPr>
+          <w:b/>
+          <w:color w:val="888888"/>
+          <w:sz w:val="18"/>
+        </w:rPr>
+        <w:t xml:space="preserve">Publicado: </w:t>
+      </w:r>
+      <w:r>
+        <w:rPr>
+          <w:color w:val="888888"/>
+          <w:sz w:val="18"/>
+        </w:rPr>
+        <w:t xml:space="preserve">2026-07-03   </w:t>
+      </w:r>
+      <w:hyperlink r:id="rId19">
+        <w:r>
+          <w:rPr>
+            <w:color w:val="1A4D2E"/>
+            <w:u w:val="single"/>
+            <w:b/>
+          </w:rPr>
+          <w:t>Acessar materia</w:t>
+        </w:r>
+      </w:hyperlink>
+    </w:p>
+    <w:p>
+      <w:pPr>
+        <w:spacing w:after="120"/>
+      </w:pPr>
+      <w:r>
+        <w:rPr>
+          <w:i/>
+          <w:color w:val="888888"/>
+          <w:sz w:val="16"/>
+        </w:rPr>
+        <w:t>Legislação federal que cria uma nova instituição de ensino superior.</w:t>
+      </w:r>
+    </w:p>
+    <w:p>
+      <w:pPr>
+        <w:spacing w:before="160" w:after="40"/>
+      </w:pPr>
+      <w:r>
+        <w:rPr>
+          <w:b/>
+          <w:color w:val="1A1A1A"/>
+          <w:sz w:val="22"/>
+        </w:rPr>
+        <w:t xml:space="preserve">Lei nº 15.456, de 3.7.2026 - Regulamenta a profissão de protesista/ortesista ortopédico.   </w:t>
+      </w:r>
+      <w:r>
+        <w:rPr>
+          <w:b/>
+          <w:color w:val="C0392B"/>
+          <w:sz w:val="16"/>
+        </w:rPr>
+        <w:t>[ALTA]</w:t>
+      </w:r>
+    </w:p>
+    <w:p>
+      <w:pPr>
+        <w:spacing w:after="40"/>
+      </w:pPr>
+      <w:r>
+        <w:rPr>
+          <w:color w:val="4A4A4A"/>
+          <w:sz w:val="20"/>
+        </w:rPr>
+        <w:t>Regulamenta a profissão de protesista/ortesista ortopédico.</w:t>
+      </w:r>
+    </w:p>
+    <w:p>
+      <w:pPr>
+        <w:spacing w:after="40"/>
+      </w:pPr>
+      <w:r>
+        <w:rPr>
+          <w:b/>
+          <w:color w:val="888888"/>
+          <w:sz w:val="18"/>
+        </w:rPr>
+        <w:t xml:space="preserve">Publicado: </w:t>
+      </w:r>
+      <w:r>
+        <w:rPr>
+          <w:color w:val="888888"/>
+          <w:sz w:val="18"/>
+        </w:rPr>
+        <w:t xml:space="preserve">2026-07-03   </w:t>
+      </w:r>
+      <w:hyperlink r:id="rId20">
+        <w:r>
+          <w:rPr>
+            <w:color w:val="1A4D2E"/>
+            <w:u w:val="single"/>
+            <w:b/>
+          </w:rPr>
+          <w:t>Acessar materia</w:t>
+        </w:r>
+      </w:hyperlink>
+    </w:p>
+    <w:p>
+      <w:pPr>
+        <w:spacing w:after="120"/>
+      </w:pPr>
+      <w:r>
+        <w:rPr>
+          <w:i/>
+          <w:color w:val="888888"/>
+          <w:sz w:val="16"/>
+        </w:rPr>
+        <w:t>Legislação federal que regulamenta uma profissão.</w:t>
       </w:r>
     </w:p>
     <w:p/>
@@ -1093,15 +1625,15 @@
           <w:color w:val="1A1A1A"/>
           <w:sz w:val="22"/>
         </w:rPr>
-        <w:t xml:space="preserve">Participe do Momento Capacita – Falando de Regulação: Consulta Pública nº 17/2026 e o Processo Sancionador de Monitoramento do Mercado   </w:t>
+        <w:t xml:space="preserve">Vai participar do Encontro CCEE – Operação e Tecnologia em Movimento? Confira a programação e os palestrantes confirmados   </w:t>
       </w:r>
       <w:r>
         <w:rPr>
           <w:b/>
-          <w:color w:val="D68910"/>
+          <w:color w:val="7F8C8D"/>
           <w:sz w:val="16"/>
         </w:rPr>
-        <w:t>[MÉDIA]</w:t>
+        <w:t>[BAIXA]</w:t>
       </w:r>
     </w:p>
     <w:p>
@@ -1113,7 +1645,7 @@
           <w:color w:val="4A4A4A"/>
           <w:sz w:val="20"/>
         </w:rPr>
-        <w:t>Evento para entender a proposta da ANEEL sobre consulta pública e processo sancionador de monitoramento do mercado, permitindo contribuições fundamentadas.</w:t>
+        <w:t>Evento reúne especialistas para discutir o futuro do setor elétrico, com programação e palestrantes confirmados.</w:t>
       </w:r>
     </w:p>
     <w:p>
@@ -1133,9 +1665,9 @@
           <w:color w:val="888888"/>
           <w:sz w:val="18"/>
         </w:rPr>
-        <w:t xml:space="preserve">2026-07-02   </w:t>
+        <w:t xml:space="preserve">2026-07-06   </w:t>
       </w:r>
-      <w:hyperlink r:id="rId17">
+      <w:hyperlink r:id="rId21">
         <w:r>
           <w:rPr>
             <w:color w:val="1A4D2E"/>
@@ -1156,29 +1688,8 @@
           <w:color w:val="888888"/>
           <w:sz w:val="16"/>
         </w:rPr>
-        <w:t>Divulgação de evento sobre consulta pública e processo sancionador, relevante para agentes do setor elétrico.</w:t>
+        <w:t>Notícia sobre evento institucional da CCEE.</w:t>
       </w:r>
-    </w:p>
-    <w:p>
-      <w:pPr>
-        <w:spacing w:before="240" w:after="80"/>
-      </w:pPr>
-      <w:r>
-        <w:rPr>
-          <w:b/>
-          <w:color w:val="1A4D2E"/>
-          <w:sz w:val="20"/>
-        </w:rPr>
-        <w:t>MME | NOTÍCIAS</w:t>
-      </w:r>
-    </w:p>
-    <w:p>
-      <w:pPr>
-        <w:spacing w:before="0" w:after="40"/>
-        <w:pBdr>
-          <w:bottom w:val="single" w:sz="8" w:space="1" w:color="1A4D2E"/>
-        </w:pBdr>
-      </w:pPr>
     </w:p>
     <w:p>
       <w:pPr>
@@ -1190,15 +1701,15 @@
           <w:color w:val="1A1A1A"/>
           <w:sz w:val="22"/>
         </w:rPr>
-        <w:t xml:space="preserve">Primeiro caderno do PDE 2036 reúne contexto, perspectivas e premissas para o setor energético   </w:t>
+        <w:t xml:space="preserve">No segundo dia do EVEx 2026, Fórum CCEE amplia diálogo sobre o futuro da abertura do mercado, segurança e certificação   </w:t>
       </w:r>
       <w:r>
         <w:rPr>
           <w:b/>
-          <w:color w:val="C0392B"/>
+          <w:color w:val="7F8C8D"/>
           <w:sz w:val="16"/>
         </w:rPr>
-        <w:t>[ALTA]</w:t>
+        <w:t>[BAIXA]</w:t>
       </w:r>
     </w:p>
     <w:p>
@@ -1210,7 +1721,7 @@
           <w:color w:val="4A4A4A"/>
           <w:sz w:val="20"/>
         </w:rPr>
-        <w:t>MME publica o primeiro caderno do Plano Decenal de Expansão de Energia (PDE 2036), com bases para o planejamento estratégico do setor energético.</w:t>
+        <w:t>Fórum CCEE discutiu a abertura do mercado, segurança e certificação no segundo dia do EVEx 2026, com participação de diretores.</w:t>
       </w:r>
     </w:p>
     <w:p>
@@ -1232,7 +1743,7 @@
         </w:rPr>
         <w:t xml:space="preserve">2026-07-03   </w:t>
       </w:r>
-      <w:hyperlink r:id="rId11">
+      <w:hyperlink r:id="rId22">
         <w:r>
           <w:rPr>
             <w:color w:val="1A4D2E"/>
@@ -1253,8 +1764,29 @@
           <w:color w:val="888888"/>
           <w:sz w:val="16"/>
         </w:rPr>
-        <w:t>Publicação de documento estratégico para o planejamento de longo prazo do setor energético, com impacto em investimentos e políticas.</w:t>
+        <w:t>Notícia sobre evento institucional e diálogo setorial.</w:t>
       </w:r>
+    </w:p>
+    <w:p>
+      <w:pPr>
+        <w:spacing w:before="240" w:after="80"/>
+      </w:pPr>
+      <w:r>
+        <w:rPr>
+          <w:b/>
+          <w:color w:val="1A4D2E"/>
+          <w:sz w:val="20"/>
+        </w:rPr>
+        <w:t>ANP | NOTÍCIAS</w:t>
+      </w:r>
+    </w:p>
+    <w:p>
+      <w:pPr>
+        <w:spacing w:before="0" w:after="40"/>
+        <w:pBdr>
+          <w:bottom w:val="single" w:sz="8" w:space="1" w:color="1A4D2E"/>
+        </w:pBdr>
+      </w:pPr>
     </w:p>
     <w:p>
       <w:pPr>
@@ -1266,15 +1798,15 @@
           <w:color w:val="1A1A1A"/>
           <w:sz w:val="22"/>
         </w:rPr>
-        <w:t xml:space="preserve">MME fortalece agenda regulatória com 200 atos normativos elaborados pela SNPGB   </w:t>
+        <w:t xml:space="preserve">Período eleitoral: ANP já utiliza os perfis temporários nas redes sociais   </w:t>
       </w:r>
       <w:r>
         <w:rPr>
           <w:b/>
-          <w:color w:val="C0392B"/>
+          <w:color w:val="7F8C8D"/>
           <w:sz w:val="16"/>
         </w:rPr>
-        <w:t>[ALTA]</w:t>
+        <w:t>[BAIXA]</w:t>
       </w:r>
     </w:p>
     <w:p>
@@ -1286,7 +1818,7 @@
           <w:color w:val="4A4A4A"/>
           <w:sz w:val="20"/>
         </w:rPr>
-        <w:t>MME fortalece sua agenda regulatória com a elaboração de 200 atos normativos pela SNPGB, visando modernizar o ambiente, ampliar segurança jurídica e impulsionar o setor energético.</w:t>
+        <w:t>A ANP informa que já está utilizando perfis temporários nas redes sociais em adequação ao período eleitoral.</w:t>
       </w:r>
     </w:p>
     <w:p>
@@ -1306,9 +1838,9 @@
           <w:color w:val="888888"/>
           <w:sz w:val="18"/>
         </w:rPr>
-        <w:t xml:space="preserve">2026-07-02   </w:t>
+        <w:t xml:space="preserve">2026-07-06   </w:t>
       </w:r>
-      <w:hyperlink r:id="rId12">
+      <w:hyperlink r:id="rId23">
         <w:r>
           <w:rPr>
             <w:color w:val="1A4D2E"/>
@@ -1329,7 +1861,7 @@
           <w:color w:val="888888"/>
           <w:sz w:val="16"/>
         </w:rPr>
-        <w:t>Ações para modernizar o ambiente regulatório do setor energético, com impacto na segurança jurídica e desenvolvimento setorial.</w:t>
+        <w:t>Notícia institucional sobre adequação a período eleitoral.</w:t>
       </w:r>
     </w:p>
     <w:p>
@@ -1342,15 +1874,15 @@
           <w:color w:val="1A1A1A"/>
           <w:sz w:val="22"/>
         </w:rPr>
-        <w:t xml:space="preserve">Projeto Piraquê fortalece sistema elétrico e amplia escoamento de energia solar em Minas Gerais e no Espírito Santo   </w:t>
+        <w:t xml:space="preserve">Seca na Região Norte: ANP acompanha abastecimento de combustíveis   </w:t>
       </w:r>
       <w:r>
         <w:rPr>
           <w:b/>
-          <w:color w:val="C0392B"/>
+          <w:color w:val="D68910"/>
           <w:sz w:val="16"/>
         </w:rPr>
-        <w:t>[ALTA]</w:t>
+        <w:t>[MÉDIA]</w:t>
       </w:r>
     </w:p>
     <w:p>
@@ -1362,7 +1894,7 @@
           <w:color w:val="4A4A4A"/>
           <w:sz w:val="20"/>
         </w:rPr>
-        <w:t>Projeto Piraquê, com R$ 3,65 bilhões em investimentos, adiciona 1.140 km de linhas, fortalecendo o sistema elétrico e escoamento de energia solar em MG e ES.</w:t>
+        <w:t>A ANP está acompanhando o abastecimento de combustíveis na Região Norte devido à seca, monitorando a situação.</w:t>
       </w:r>
     </w:p>
     <w:p>
@@ -1382,9 +1914,9 @@
           <w:color w:val="888888"/>
           <w:sz w:val="18"/>
         </w:rPr>
-        <w:t xml:space="preserve">2026-07-02   </w:t>
+        <w:t xml:space="preserve">2026-07-03   </w:t>
       </w:r>
-      <w:hyperlink r:id="rId13">
+      <w:hyperlink r:id="rId24">
         <w:r>
           <w:rPr>
             <w:color w:val="1A4D2E"/>
@@ -1405,7 +1937,7 @@
           <w:color w:val="888888"/>
           <w:sz w:val="16"/>
         </w:rPr>
-        <w:t>Grande investimento em infraestrutura elétrica, crucial para a expansão da energia solar e a segurança do Sistema Interligado Nacional.</w:t>
+        <w:t>Acompanhamento regulatório de situação que afeta o abastecimento de combustíveis.</w:t>
       </w:r>
     </w:p>
     <w:p>
@@ -1418,15 +1950,15 @@
           <w:color w:val="1A1A1A"/>
           <w:sz w:val="22"/>
         </w:rPr>
-        <w:t xml:space="preserve">MME avança na estruturação da política para Pequenos Reatores Modulares durante terceira reunião do GT-19   </w:t>
+        <w:t xml:space="preserve">Entre os dias 29/6 e 3/7, a ANP realizou 146 ações de fiscalização com foco em preços abusivos   </w:t>
       </w:r>
       <w:r>
         <w:rPr>
           <w:b/>
-          <w:color w:val="C0392B"/>
+          <w:color w:val="D68910"/>
           <w:sz w:val="16"/>
         </w:rPr>
-        <w:t>[ALTA]</w:t>
+        <w:t>[MÉDIA]</w:t>
       </w:r>
     </w:p>
     <w:p>
@@ -1438,7 +1970,7 @@
           <w:color w:val="4A4A4A"/>
           <w:sz w:val="20"/>
         </w:rPr>
-        <w:t>MME avança na política para Pequenos Reatores Modulares (SMRs) em reunião do GT-19, reforçando a colaboração interinstitucional para a adoção de SMRs no Brasil.</w:t>
+        <w:t>A ANP realizou 146 ações de fiscalização em 16 estados, com foco em preços abusivos de combustíveis.</w:t>
       </w:r>
     </w:p>
     <w:p>
@@ -1458,539 +1990,7 @@
           <w:color w:val="888888"/>
           <w:sz w:val="18"/>
         </w:rPr>
-        <w:t xml:space="preserve">2026-07-02   </w:t>
-      </w:r>
-      <w:hyperlink r:id="rId18">
-        <w:r>
-          <w:rPr>
-            <w:color w:val="1A4D2E"/>
-            <w:u w:val="single"/>
-            <w:b/>
-          </w:rPr>
-          <w:t>Acessar materia</w:t>
-        </w:r>
-      </w:hyperlink>
-    </w:p>
-    <w:p>
-      <w:pPr>
-        <w:spacing w:after="120"/>
-      </w:pPr>
-      <w:r>
-        <w:rPr>
-          <w:i/>
-          <w:color w:val="888888"/>
-          <w:sz w:val="16"/>
-        </w:rPr>
-        <w:t>Desenvolvimento de política para energia nuclear (SMRs), com potencial impacto na matriz energética e segurança.</w:t>
-      </w:r>
-    </w:p>
-    <w:p>
-      <w:pPr>
-        <w:spacing w:before="160" w:after="40"/>
-      </w:pPr>
-      <w:r>
-        <w:rPr>
-          <w:b/>
-          <w:color w:val="1A1A1A"/>
-          <w:sz w:val="22"/>
-        </w:rPr>
-        <w:t xml:space="preserve">MME lança Referencial Básico para a Mineração Brasileira Sustentável e avança na implementação da Política Nacional de Mineração 2050   </w:t>
-      </w:r>
-      <w:r>
-        <w:rPr>
-          <w:b/>
-          <w:color w:val="C0392B"/>
-          <w:sz w:val="16"/>
-        </w:rPr>
-        <w:t>[ALTA]</w:t>
-      </w:r>
-    </w:p>
-    <w:p>
-      <w:pPr>
-        <w:spacing w:after="40"/>
-      </w:pPr>
-      <w:r>
-        <w:rPr>
-          <w:color w:val="4A4A4A"/>
-          <w:sz w:val="20"/>
-        </w:rPr>
-        <w:t>MME lança Referencial Básico para Mineração Sustentável, consolidando entregas da Política Nacional de Mineração 2050 e fortalecendo práticas ESG no setor.</w:t>
-      </w:r>
-    </w:p>
-    <w:p>
-      <w:pPr>
-        <w:spacing w:after="40"/>
-      </w:pPr>
-      <w:r>
-        <w:rPr>
-          <w:b/>
-          <w:color w:val="888888"/>
-          <w:sz w:val="18"/>
-        </w:rPr>
-        <w:t xml:space="preserve">Publicado: </w:t>
-      </w:r>
-      <w:r>
-        <w:rPr>
-          <w:color w:val="888888"/>
-          <w:sz w:val="18"/>
-        </w:rPr>
-        <w:t xml:space="preserve">2026-07-02   </w:t>
-      </w:r>
-      <w:hyperlink r:id="rId19">
-        <w:r>
-          <w:rPr>
-            <w:color w:val="1A4D2E"/>
-            <w:u w:val="single"/>
-            <w:b/>
-          </w:rPr>
-          <w:t>Acessar materia</w:t>
-        </w:r>
-      </w:hyperlink>
-    </w:p>
-    <w:p>
-      <w:pPr>
-        <w:spacing w:after="120"/>
-      </w:pPr>
-      <w:r>
-        <w:rPr>
-          <w:i/>
-          <w:color w:val="888888"/>
-          <w:sz w:val="16"/>
-        </w:rPr>
-        <w:t>Lançamento de referencial e avanço em política nacional de mineração, impactando práticas de sustentabilidade e governança no setor.</w:t>
-      </w:r>
-    </w:p>
-    <w:p>
-      <w:pPr>
-        <w:spacing w:before="160" w:after="40"/>
-      </w:pPr>
-      <w:r>
-        <w:rPr>
-          <w:b/>
-          <w:color w:val="1A1A1A"/>
-          <w:sz w:val="22"/>
-        </w:rPr>
-        <w:t xml:space="preserve">Brasil ganha estratégia de Estado para transformar a riqueza mineral em desenvolvimento sustentável de forma soberana até 2050   </w:t>
-      </w:r>
-      <w:r>
-        <w:rPr>
-          <w:b/>
-          <w:color w:val="C0392B"/>
-          <w:sz w:val="16"/>
-        </w:rPr>
-        <w:t>[ALTA]</w:t>
-      </w:r>
-    </w:p>
-    <w:p>
-      <w:pPr>
-        <w:spacing w:after="40"/>
-      </w:pPr>
-      <w:r>
-        <w:rPr>
-          <w:color w:val="4A4A4A"/>
-          <w:sz w:val="20"/>
-        </w:rPr>
-        <w:t>Plano Nacional de Mineração 2050 estabelece estratégia para o Brasil transformar sua riqueza mineral em desenvolvimento sustentável, com foco em valor agregado e responsabilidade socioambiental.</w:t>
-      </w:r>
-    </w:p>
-    <w:p>
-      <w:pPr>
-        <w:spacing w:after="40"/>
-      </w:pPr>
-      <w:r>
-        <w:rPr>
-          <w:b/>
-          <w:color w:val="888888"/>
-          <w:sz w:val="18"/>
-        </w:rPr>
-        <w:t xml:space="preserve">Publicado: </w:t>
-      </w:r>
-      <w:r>
-        <w:rPr>
-          <w:color w:val="888888"/>
-          <w:sz w:val="18"/>
-        </w:rPr>
-        <w:t xml:space="preserve">2026-07-02   </w:t>
-      </w:r>
-      <w:hyperlink r:id="rId20">
-        <w:r>
-          <w:rPr>
-            <w:color w:val="1A4D2E"/>
-            <w:u w:val="single"/>
-            <w:b/>
-          </w:rPr>
-          <w:t>Acessar materia</w:t>
-        </w:r>
-      </w:hyperlink>
-    </w:p>
-    <w:p>
-      <w:pPr>
-        <w:spacing w:after="120"/>
-      </w:pPr>
-      <w:r>
-        <w:rPr>
-          <w:i/>
-          <w:color w:val="888888"/>
-          <w:sz w:val="16"/>
-        </w:rPr>
-        <w:t>Estratégia de Estado de longo prazo para o setor mineral, com impacto econômico, social e ambiental.</w:t>
-      </w:r>
-    </w:p>
-    <w:p>
-      <w:pPr>
-        <w:spacing w:before="160" w:after="40"/>
-      </w:pPr>
-      <w:r>
-        <w:rPr>
-          <w:b/>
-          <w:color w:val="1A1A1A"/>
-          <w:sz w:val="22"/>
-        </w:rPr>
-        <w:t xml:space="preserve">CNPM aprova diretrizes para reduzir ociosidade e ampliar oferta de áreas minerárias   </w:t>
-      </w:r>
-      <w:r>
-        <w:rPr>
-          <w:b/>
-          <w:color w:val="C0392B"/>
-          <w:sz w:val="16"/>
-        </w:rPr>
-        <w:t>[ALTA]</w:t>
-      </w:r>
-    </w:p>
-    <w:p>
-      <w:pPr>
-        <w:spacing w:after="40"/>
-      </w:pPr>
-      <w:r>
-        <w:rPr>
-          <w:color w:val="4A4A4A"/>
-          <w:sz w:val="20"/>
-        </w:rPr>
-        <w:t>CNPM aprova diretrizes para órgãos federais acelerarem o retorno de áreas minerárias inativas ao ambiente concorrencial, visando reduzir ociosidade e ampliar a oferta.</w:t>
-      </w:r>
-    </w:p>
-    <w:p>
-      <w:pPr>
-        <w:spacing w:after="40"/>
-      </w:pPr>
-      <w:r>
-        <w:rPr>
-          <w:b/>
-          <w:color w:val="888888"/>
-          <w:sz w:val="18"/>
-        </w:rPr>
-        <w:t xml:space="preserve">Publicado: </w:t>
-      </w:r>
-      <w:r>
-        <w:rPr>
-          <w:color w:val="888888"/>
-          <w:sz w:val="18"/>
-        </w:rPr>
-        <w:t xml:space="preserve">2026-07-02   </w:t>
-      </w:r>
-      <w:hyperlink r:id="rId21">
-        <w:r>
-          <w:rPr>
-            <w:color w:val="1A4D2E"/>
-            <w:u w:val="single"/>
-            <w:b/>
-          </w:rPr>
-          <w:t>Acessar materia</w:t>
-        </w:r>
-      </w:hyperlink>
-    </w:p>
-    <w:p>
-      <w:pPr>
-        <w:spacing w:after="120"/>
-      </w:pPr>
-      <w:r>
-        <w:rPr>
-          <w:i/>
-          <w:color w:val="888888"/>
-          <w:sz w:val="16"/>
-        </w:rPr>
-        <w:t>Resolução que impacta diretamente a disponibilidade de áreas para exploração mineral e a competitividade do setor.</w:t>
-      </w:r>
-    </w:p>
-    <w:p>
-      <w:pPr>
-        <w:spacing w:before="160" w:after="40"/>
-      </w:pPr>
-      <w:r>
-        <w:rPr>
-          <w:b/>
-          <w:color w:val="1A1A1A"/>
-          <w:sz w:val="22"/>
-        </w:rPr>
-        <w:t xml:space="preserve">CNPM recomenda, em articulação com os entes federativos, alternativas para disciplinar taxas de fiscalização mineral de estados e municípios   </w:t>
-      </w:r>
-      <w:r>
-        <w:rPr>
-          <w:b/>
-          <w:color w:val="C0392B"/>
-          <w:sz w:val="16"/>
-        </w:rPr>
-        <w:t>[ALTA]</w:t>
-      </w:r>
-    </w:p>
-    <w:p>
-      <w:pPr>
-        <w:spacing w:after="40"/>
-      </w:pPr>
-      <w:r>
-        <w:rPr>
-          <w:color w:val="4A4A4A"/>
-          <w:sz w:val="20"/>
-        </w:rPr>
-        <w:t>CNPM recomenda alternativas para disciplinar taxas de fiscalização mineral de estados e municípios, com caráter orientativo e preservando a autonomia tributária dos entes federativos.</w:t>
-      </w:r>
-    </w:p>
-    <w:p>
-      <w:pPr>
-        <w:spacing w:after="40"/>
-      </w:pPr>
-      <w:r>
-        <w:rPr>
-          <w:b/>
-          <w:color w:val="888888"/>
-          <w:sz w:val="18"/>
-        </w:rPr>
-        <w:t xml:space="preserve">Publicado: </w:t>
-      </w:r>
-      <w:r>
-        <w:rPr>
-          <w:color w:val="888888"/>
-          <w:sz w:val="18"/>
-        </w:rPr>
-        <w:t xml:space="preserve">2026-07-02   </w:t>
-      </w:r>
-      <w:hyperlink r:id="rId22">
-        <w:r>
-          <w:rPr>
-            <w:color w:val="1A4D2E"/>
-            <w:u w:val="single"/>
-            <w:b/>
-          </w:rPr>
-          <w:t>Acessar materia</w:t>
-        </w:r>
-      </w:hyperlink>
-    </w:p>
-    <w:p>
-      <w:pPr>
-        <w:spacing w:after="120"/>
-      </w:pPr>
-      <w:r>
-        <w:rPr>
-          <w:i/>
-          <w:color w:val="888888"/>
-          <w:sz w:val="16"/>
-        </w:rPr>
-        <w:t>Recomendação sobre taxas de fiscalização mineral, com impacto potencial na carga tributária e segurança jurídica para empresas do setor.</w:t>
-      </w:r>
-    </w:p>
-    <w:p>
-      <w:pPr>
-        <w:spacing w:before="160" w:after="40"/>
-      </w:pPr>
-      <w:r>
-        <w:rPr>
-          <w:b/>
-          <w:color w:val="1A1A1A"/>
-          <w:sz w:val="22"/>
-        </w:rPr>
-        <w:t xml:space="preserve">Governo do Brasil aprova o Plano Decenal de Expansão de Energia 2035   </w:t>
-      </w:r>
-      <w:r>
-        <w:rPr>
-          <w:b/>
-          <w:color w:val="C0392B"/>
-          <w:sz w:val="16"/>
-        </w:rPr>
-        <w:t>[ALTA]</w:t>
-      </w:r>
-    </w:p>
-    <w:p>
-      <w:pPr>
-        <w:spacing w:after="40"/>
-      </w:pPr>
-      <w:r>
-        <w:rPr>
-          <w:color w:val="4A4A4A"/>
-          <w:sz w:val="20"/>
-        </w:rPr>
-        <w:t>Governo aprova o Plano Decenal de Expansão de Energia 2035, reforçando o protagonismo brasileiro na transição energética com expansão da oferta e matrizes renováveis.</w:t>
-      </w:r>
-    </w:p>
-    <w:p>
-      <w:pPr>
-        <w:spacing w:after="40"/>
-      </w:pPr>
-      <w:r>
-        <w:rPr>
-          <w:b/>
-          <w:color w:val="888888"/>
-          <w:sz w:val="18"/>
-        </w:rPr>
-        <w:t xml:space="preserve">Publicado: </w:t>
-      </w:r>
-      <w:r>
-        <w:rPr>
-          <w:color w:val="888888"/>
-          <w:sz w:val="18"/>
-        </w:rPr>
-        <w:t xml:space="preserve">2026-07-02   </w:t>
-      </w:r>
-      <w:hyperlink r:id="rId23">
-        <w:r>
-          <w:rPr>
-            <w:color w:val="1A4D2E"/>
-            <w:u w:val="single"/>
-            <w:b/>
-          </w:rPr>
-          <w:t>Acessar materia</w:t>
-        </w:r>
-      </w:hyperlink>
-    </w:p>
-    <w:p>
-      <w:pPr>
-        <w:spacing w:after="120"/>
-      </w:pPr>
-      <w:r>
-        <w:rPr>
-          <w:i/>
-          <w:color w:val="888888"/>
-          <w:sz w:val="16"/>
-        </w:rPr>
-        <w:t>Aprovação de plano estratégico de energia, fundamental para a transição energética e investimentos no setor.</w:t>
-      </w:r>
-    </w:p>
-    <w:p>
-      <w:pPr>
-        <w:spacing w:before="160" w:after="40"/>
-      </w:pPr>
-      <w:r>
-        <w:rPr>
-          <w:b/>
-          <w:color w:val="1A1A1A"/>
-          <w:sz w:val="22"/>
-        </w:rPr>
-        <w:t xml:space="preserve">CNPM recomenda classificação de baixo risco para pesquisa mineral sem guia de utilização   </w:t>
-      </w:r>
-      <w:r>
-        <w:rPr>
-          <w:b/>
-          <w:color w:val="C0392B"/>
-          <w:sz w:val="16"/>
-        </w:rPr>
-        <w:t>[ALTA]</w:t>
-      </w:r>
-    </w:p>
-    <w:p>
-      <w:pPr>
-        <w:spacing w:after="40"/>
-      </w:pPr>
-      <w:r>
-        <w:rPr>
-          <w:color w:val="4A4A4A"/>
-          <w:sz w:val="20"/>
-        </w:rPr>
-        <w:t>CNPM recomenda classificação de baixo risco para pesquisa mineral sem guia de utilização, buscando uniformizar a classificação pelos entes federativos.</w:t>
-      </w:r>
-    </w:p>
-    <w:p>
-      <w:pPr>
-        <w:spacing w:after="40"/>
-      </w:pPr>
-      <w:r>
-        <w:rPr>
-          <w:b/>
-          <w:color w:val="888888"/>
-          <w:sz w:val="18"/>
-        </w:rPr>
-        <w:t xml:space="preserve">Publicado: </w:t>
-      </w:r>
-      <w:r>
-        <w:rPr>
-          <w:color w:val="888888"/>
-          <w:sz w:val="18"/>
-        </w:rPr>
-        <w:t xml:space="preserve">2026-07-02   </w:t>
-      </w:r>
-      <w:hyperlink r:id="rId24">
-        <w:r>
-          <w:rPr>
-            <w:color w:val="1A4D2E"/>
-            <w:u w:val="single"/>
-            <w:b/>
-          </w:rPr>
-          <w:t>Acessar materia</w:t>
-        </w:r>
-      </w:hyperlink>
-    </w:p>
-    <w:p>
-      <w:pPr>
-        <w:spacing w:after="120"/>
-      </w:pPr>
-      <w:r>
-        <w:rPr>
-          <w:i/>
-          <w:color w:val="888888"/>
-          <w:sz w:val="16"/>
-        </w:rPr>
-        <w:t>Recomendação que visa uniformizar a classificação de risco na pesquisa mineral, impactando a burocracia e segurança jurídica para empresas.</w:t>
-      </w:r>
-    </w:p>
-    <w:p>
-      <w:pPr>
-        <w:spacing w:before="160" w:after="40"/>
-      </w:pPr>
-      <w:r>
-        <w:rPr>
-          <w:b/>
-          <w:color w:val="1A1A1A"/>
-          <w:sz w:val="22"/>
-        </w:rPr>
-        <w:t xml:space="preserve">Leilões de transmissão transformam infraestrutura elétrica e impulsionam crescimento do setor energético   </w:t>
-      </w:r>
-      <w:r>
-        <w:rPr>
-          <w:b/>
-          <w:color w:val="C0392B"/>
-          <w:sz w:val="16"/>
-        </w:rPr>
-        <w:t>[ALTA]</w:t>
-      </w:r>
-    </w:p>
-    <w:p>
-      <w:pPr>
-        <w:spacing w:after="40"/>
-      </w:pPr>
-      <w:r>
-        <w:rPr>
-          <w:color w:val="4A4A4A"/>
-          <w:sz w:val="20"/>
-        </w:rPr>
-        <w:t>Leilões de transmissão impulsionam investimentos recordes e expansão da rede, fortalecendo a segurança do sistema elétrico e preparando o Brasil para o aumento da demanda por energia.</w:t>
-      </w:r>
-    </w:p>
-    <w:p>
-      <w:pPr>
-        <w:spacing w:after="40"/>
-      </w:pPr>
-      <w:r>
-        <w:rPr>
-          <w:b/>
-          <w:color w:val="888888"/>
-          <w:sz w:val="18"/>
-        </w:rPr>
-        <w:t xml:space="preserve">Publicado: </w:t>
-      </w:r>
-      <w:r>
-        <w:rPr>
-          <w:color w:val="888888"/>
-          <w:sz w:val="18"/>
-        </w:rPr>
-        <w:t xml:space="preserve">2026-07-02   </w:t>
+        <w:t xml:space="preserve">2026-07-03   </w:t>
       </w:r>
       <w:hyperlink r:id="rId25">
         <w:r>
@@ -2013,8 +2013,29 @@
           <w:color w:val="888888"/>
           <w:sz w:val="16"/>
         </w:rPr>
-        <w:t>Impacto significativo dos leilões na infraestrutura elétrica e no crescimento do setor energético, com grandes investimentos.</w:t>
+        <w:t>Ações de fiscalização setorial com impacto direto no mercado de combustíveis.</w:t>
       </w:r>
+    </w:p>
+    <w:p>
+      <w:pPr>
+        <w:spacing w:before="240" w:after="80"/>
+      </w:pPr>
+      <w:r>
+        <w:rPr>
+          <w:b/>
+          <w:color w:val="1A4D2E"/>
+          <w:sz w:val="20"/>
+        </w:rPr>
+        <w:t>MME | NOTÍCIAS</w:t>
+      </w:r>
+    </w:p>
+    <w:p>
+      <w:pPr>
+        <w:spacing w:before="0" w:after="40"/>
+        <w:pBdr>
+          <w:bottom w:val="single" w:sz="8" w:space="1" w:color="1A4D2E"/>
+        </w:pBdr>
+      </w:pPr>
     </w:p>
     <w:p>
       <w:pPr>
@@ -2026,15 +2047,15 @@
           <w:color w:val="1A1A1A"/>
           <w:sz w:val="22"/>
         </w:rPr>
-        <w:t xml:space="preserve">Gás do Povo atinge cobertura de 100% do público-alvo em todo o Brasil   </w:t>
+        <w:t xml:space="preserve">Entenda cada item cobrado na conta de luz e como acompanhar o consumo   </w:t>
       </w:r>
       <w:r>
         <w:rPr>
           <w:b/>
-          <w:color w:val="D68910"/>
+          <w:color w:val="7F8C8D"/>
           <w:sz w:val="16"/>
         </w:rPr>
-        <w:t>[MÉDIA]</w:t>
+        <w:t>[BAIXA]</w:t>
       </w:r>
     </w:p>
     <w:p>
@@ -2046,7 +2067,7 @@
           <w:color w:val="4A4A4A"/>
           <w:sz w:val="20"/>
         </w:rPr>
-        <w:t>O programa Gás do Povo alcança 100% de cobertura do público-alvo no Brasil, garantindo acesso ao botijão para todas as famílias elegíveis através de credenciamento de revendas e planos de atendimento.</w:t>
+        <w:t>Explica bandeiras tarifárias, ICMS, contribuição de iluminação pública e outros encargos da fatura de energia elétrica.</w:t>
       </w:r>
     </w:p>
     <w:p>
@@ -2089,7 +2110,7 @@
           <w:color w:val="888888"/>
           <w:sz w:val="16"/>
         </w:rPr>
-        <w:t>Conclusão de programa social de acesso a gás, com impacto direto na população e na distribuição de energia.</w:t>
+        <w:t>Conteúdo informativo geral para o consumidor.</w:t>
       </w:r>
     </w:p>
     <w:p>
@@ -2102,15 +2123,15 @@
           <w:color w:val="1A1A1A"/>
           <w:sz w:val="22"/>
         </w:rPr>
-        <w:t xml:space="preserve">Governo do Brasil lança aplicativo para ampliar atendimento do programa Luz para Todos   </w:t>
+        <w:t xml:space="preserve">O que são sistemas isolados?   </w:t>
       </w:r>
       <w:r>
         <w:rPr>
           <w:b/>
-          <w:color w:val="D68910"/>
+          <w:color w:val="7F8C8D"/>
           <w:sz w:val="16"/>
         </w:rPr>
-        <w:t>[MÉDIA]</w:t>
+        <w:t>[BAIXA]</w:t>
       </w:r>
     </w:p>
     <w:p>
@@ -2122,7 +2143,7 @@
           <w:color w:val="4A4A4A"/>
           <w:sz w:val="20"/>
         </w:rPr>
-        <w:t>Governo lança aplicativo para o programa Luz para Todos, permitindo registrar e acompanhar solicitações e mapear famílias sem acesso à energia elétrica.</w:t>
+        <w:t>Explica como localidades isoladas garantem abastecimento elétrico com tecnologias eficientes e sustentáveis.</w:t>
       </w:r>
     </w:p>
     <w:p>
@@ -2142,7 +2163,7 @@
           <w:color w:val="888888"/>
           <w:sz w:val="18"/>
         </w:rPr>
-        <w:t xml:space="preserve">2026-07-02   </w:t>
+        <w:t xml:space="preserve">2026-07-03   </w:t>
       </w:r>
       <w:hyperlink r:id="rId27">
         <w:r>
@@ -2165,7 +2186,7 @@
           <w:color w:val="888888"/>
           <w:sz w:val="16"/>
         </w:rPr>
-        <w:t>Lançamento de ferramenta digital para programa social, visando ampliar o acesso à energia elétrica.</w:t>
+        <w:t>Conteúdo informativo geral sobre o setor elétrico.</w:t>
       </w:r>
     </w:p>
     <w:p>
@@ -2178,15 +2199,15 @@
           <w:color w:val="1A1A1A"/>
           <w:sz w:val="22"/>
         </w:rPr>
-        <w:t xml:space="preserve">MME destaca avanços em eficiência energética em conferência global da IEA   </w:t>
+        <w:t xml:space="preserve">Saiba a diferença entre minério, mineral e rocha   </w:t>
       </w:r>
       <w:r>
         <w:rPr>
           <w:b/>
-          <w:color w:val="D68910"/>
+          <w:color w:val="7F8C8D"/>
           <w:sz w:val="16"/>
         </w:rPr>
-        <w:t>[MÉDIA]</w:t>
+        <w:t>[BAIXA]</w:t>
       </w:r>
     </w:p>
     <w:p>
@@ -2198,7 +2219,7 @@
           <w:color w:val="4A4A4A"/>
           <w:sz w:val="20"/>
         </w:rPr>
-        <w:t>MME apresenta políticas de padrões mínimos para eletrodomésticos e defende indicadores para países em desenvolvimento em conferência global da IEA sobre eficiência energética.</w:t>
+        <w:t>Entenda as origens e aplicações de minério, mineral e rocha no cotidiano e desenvolvimento da sociedade.</w:t>
       </w:r>
     </w:p>
     <w:p>
@@ -2218,7 +2239,7 @@
           <w:color w:val="888888"/>
           <w:sz w:val="18"/>
         </w:rPr>
-        <w:t xml:space="preserve">2026-07-02   </w:t>
+        <w:t xml:space="preserve">2026-07-03   </w:t>
       </w:r>
       <w:hyperlink r:id="rId28">
         <w:r>
@@ -2241,7 +2262,7 @@
           <w:color w:val="888888"/>
           <w:sz w:val="16"/>
         </w:rPr>
-        <w:t>Participação em evento internacional e apresentação de políticas de eficiência energética, com potencial impacto regulatório futuro.</w:t>
+        <w:t>Conteúdo informativo geral sobre mineração.</w:t>
       </w:r>
     </w:p>
     <w:p>
@@ -2254,7 +2275,7 @@
           <w:color w:val="1A1A1A"/>
           <w:sz w:val="22"/>
         </w:rPr>
-        <w:t xml:space="preserve">CNPM institui GT para propor Programa Nacional de Redução e Reaproveitamento de Rejeitos da Mineração   </w:t>
+        <w:t xml:space="preserve">Saiba como ter acesso ao Programa Gás do Povo   </w:t>
       </w:r>
       <w:r>
         <w:rPr>
@@ -2274,7 +2295,7 @@
           <w:color w:val="4A4A4A"/>
           <w:sz w:val="20"/>
         </w:rPr>
-        <w:t>CNPM institui Grupo de Trabalho para propor programa nacional de redução e reaproveitamento de rejeitos da mineração, avaliando a recuperação de terras degradadas.</w:t>
+        <w:t>Entenda quem pode participar e como funciona o recebimento do benefício do Programa Gás do Povo.</w:t>
       </w:r>
     </w:p>
     <w:p>
@@ -2294,7 +2315,7 @@
           <w:color w:val="888888"/>
           <w:sz w:val="18"/>
         </w:rPr>
-        <w:t xml:space="preserve">2026-07-02   </w:t>
+        <w:t xml:space="preserve">2026-07-03   </w:t>
       </w:r>
       <w:hyperlink r:id="rId29">
         <w:r>
@@ -2317,7 +2338,7 @@
           <w:color w:val="888888"/>
           <w:sz w:val="16"/>
         </w:rPr>
-        <w:t>Criação de grupo de trabalho para desenvolver política ambiental no setor de mineração, com foco em sustentabilidade.</w:t>
+        <w:t>Notícia sobre programa social com impacto direto em cidadãos.</w:t>
       </w:r>
     </w:p>
     <w:p>
@@ -2330,15 +2351,15 @@
           <w:color w:val="1A1A1A"/>
           <w:sz w:val="22"/>
         </w:rPr>
-        <w:t xml:space="preserve">MME promove seminário para apresentar Plano de Ação Nacional voltado à eliminação do uso de mercúrio na mineração de ouro   </w:t>
+        <w:t xml:space="preserve">A Força dos Ventos marítimos   </w:t>
       </w:r>
       <w:r>
         <w:rPr>
           <w:b/>
-          <w:color w:val="D68910"/>
+          <w:color w:val="7F8C8D"/>
           <w:sz w:val="16"/>
         </w:rPr>
-        <w:t>[MÉDIA]</w:t>
+        <w:t>[BAIXA]</w:t>
       </w:r>
     </w:p>
     <w:p>
@@ -2350,7 +2371,7 @@
           <w:color w:val="4A4A4A"/>
           <w:sz w:val="20"/>
         </w:rPr>
-        <w:t>MME promove seminário para apresentar Plano de Ação Nacional para eliminação do mercúrio na mineração de ouro, reunindo stakeholders para discutir estratégias de implementação.</w:t>
+        <w:t>Entenda a participação da energia eólica offshore na matriz energética brasileira.</w:t>
       </w:r>
     </w:p>
     <w:p>
@@ -2370,7 +2391,7 @@
           <w:color w:val="888888"/>
           <w:sz w:val="18"/>
         </w:rPr>
-        <w:t xml:space="preserve">2026-07-02   </w:t>
+        <w:t xml:space="preserve">2026-07-03   </w:t>
       </w:r>
       <w:hyperlink r:id="rId30">
         <w:r>
@@ -2393,7 +2414,7 @@
           <w:color w:val="888888"/>
           <w:sz w:val="16"/>
         </w:rPr>
-        <w:t>Evento para discutir plano de ação ambiental, relevante para a sustentabilidade na mineração.</w:t>
+        <w:t>Conteúdo informativo geral sobre energia renovável.</w:t>
       </w:r>
     </w:p>
     <w:p>
@@ -2406,15 +2427,15 @@
           <w:color w:val="1A1A1A"/>
           <w:sz w:val="22"/>
         </w:rPr>
-        <w:t xml:space="preserve">CNPM cria Grupo de Trabalho para avaliar papel do urânio brasileiro no Programa Nuclear e programas estratégicos de defesa e transição energética   </w:t>
+        <w:t xml:space="preserve">Como a energia elétrica é transportada pelo Brasil   </w:t>
       </w:r>
       <w:r>
         <w:rPr>
           <w:b/>
-          <w:color w:val="D68910"/>
+          <w:color w:val="7F8C8D"/>
           <w:sz w:val="16"/>
         </w:rPr>
-        <w:t>[MÉDIA]</w:t>
+        <w:t>[BAIXA]</w:t>
       </w:r>
     </w:p>
     <w:p>
@@ -2426,7 +2447,7 @@
           <w:color w:val="4A4A4A"/>
           <w:sz w:val="20"/>
         </w:rPr>
-        <w:t>CNPM cria GT para avaliar o papel do urânio brasileiro no Programa Nuclear e em programas estratégicos de defesa e transição energética, estudando sua contribuição.</w:t>
+        <w:t>Entenda a função das linhas de transmissão no transporte de energia elétrica no Brasil.</w:t>
       </w:r>
     </w:p>
     <w:p>
@@ -2446,7 +2467,7 @@
           <w:color w:val="888888"/>
           <w:sz w:val="18"/>
         </w:rPr>
-        <w:t xml:space="preserve">2026-07-02   </w:t>
+        <w:t xml:space="preserve">2026-07-03   </w:t>
       </w:r>
       <w:hyperlink r:id="rId31">
         <w:r>
@@ -2469,7 +2490,7 @@
           <w:color w:val="888888"/>
           <w:sz w:val="16"/>
         </w:rPr>
-        <w:t>Criação de grupo de trabalho para analisar recurso estratégico (urânio) e seu papel em programas nacionais.</w:t>
+        <w:t>Conteúdo informativo geral sobre infraestrutura energética.</w:t>
       </w:r>
     </w:p>
     <w:p>
@@ -2482,15 +2503,15 @@
           <w:color w:val="1A1A1A"/>
           <w:sz w:val="22"/>
         </w:rPr>
-        <w:t xml:space="preserve">CNPM aprova GT que vai mapear caminhos para ampliar o conhecimento geológico e de recursos minerais do País   </w:t>
+        <w:t xml:space="preserve">Biometano: resíduos transformados em energia   </w:t>
       </w:r>
       <w:r>
         <w:rPr>
           <w:b/>
-          <w:color w:val="D68910"/>
+          <w:color w:val="7F8C8D"/>
           <w:sz w:val="16"/>
         </w:rPr>
-        <w:t>[MÉDIA]</w:t>
+        <w:t>[BAIXA]</w:t>
       </w:r>
     </w:p>
     <w:p>
@@ -2502,7 +2523,7 @@
           <w:color w:val="4A4A4A"/>
           <w:sz w:val="20"/>
         </w:rPr>
-        <w:t>CNPM aprova Grupo de Trabalho para mapear caminhos e ampliar o conhecimento geológico e de recursos minerais do País, visando otimizar a exploração e gestão.</w:t>
+        <w:t>O biocombustível produzido a partir do aproveitamento de matéria orgânica possui aplicações semelhantes às do gás natural.</w:t>
       </w:r>
     </w:p>
     <w:p>
@@ -2522,7 +2543,7 @@
           <w:color w:val="888888"/>
           <w:sz w:val="18"/>
         </w:rPr>
-        <w:t xml:space="preserve">2026-07-02   </w:t>
+        <w:t xml:space="preserve">2026-07-03   </w:t>
       </w:r>
       <w:hyperlink r:id="rId32">
         <w:r>
@@ -2545,29 +2566,8 @@
           <w:color w:val="888888"/>
           <w:sz w:val="16"/>
         </w:rPr>
-        <w:t>Criação de grupo de trabalho para mapear e ampliar conhecimento geológico, fundamental para o planejamento do setor mineral.</w:t>
+        <w:t>Conteúdo informativo geral sobre biocombustíveis.</w:t>
       </w:r>
-    </w:p>
-    <w:p>
-      <w:pPr>
-        <w:spacing w:before="240" w:after="80"/>
-      </w:pPr>
-      <w:r>
-        <w:rPr>
-          <w:b/>
-          <w:color w:val="1A4D2E"/>
-          <w:sz w:val="20"/>
-        </w:rPr>
-        <w:t>ANEEL | ÚLTIMAS NOTÍCIAS</w:t>
-      </w:r>
-    </w:p>
-    <w:p>
-      <w:pPr>
-        <w:spacing w:before="0" w:after="40"/>
-        <w:pBdr>
-          <w:bottom w:val="single" w:sz="8" w:space="1" w:color="1A4D2E"/>
-        </w:pBdr>
-      </w:pPr>
     </w:p>
     <w:p>
       <w:pPr>
@@ -2579,15 +2579,15 @@
           <w:color w:val="1A1A1A"/>
           <w:sz w:val="22"/>
         </w:rPr>
-        <w:t xml:space="preserve">ANEEL divulga relatório sobre perdas de energia elétrica na distribuição   </w:t>
+        <w:t xml:space="preserve">DEFESO ELEITORAL 2026   </w:t>
       </w:r>
       <w:r>
         <w:rPr>
           <w:b/>
-          <w:color w:val="D68910"/>
+          <w:color w:val="7F8C8D"/>
           <w:sz w:val="16"/>
         </w:rPr>
-        <w:t>[MÉDIA]</w:t>
+        <w:t>[BAIXA]</w:t>
       </w:r>
     </w:p>
     <w:p>
@@ -2599,7 +2599,7 @@
           <w:color w:val="4A4A4A"/>
           <w:sz w:val="20"/>
         </w:rPr>
-        <w:t>ANEEL divulga relatório com dados de perdas de energia elétrica na distribuição referentes ao ano de 2025, fornecendo informações cruciais para o setor.</w:t>
+        <w:t>Aviso importante sobre o período de defeso eleitoral em 2026.</w:t>
       </w:r>
     </w:p>
     <w:p>
@@ -2619,7 +2619,7 @@
           <w:color w:val="888888"/>
           <w:sz w:val="18"/>
         </w:rPr>
-        <w:t xml:space="preserve">2026-07-02   </w:t>
+        <w:t xml:space="preserve">2026-07-03   </w:t>
       </w:r>
       <w:hyperlink r:id="rId33">
         <w:r>
@@ -2642,8 +2642,29 @@
           <w:color w:val="888888"/>
           <w:sz w:val="16"/>
         </w:rPr>
-        <w:t>Publicação de relatório técnico com dados relevantes para o setor de distribuição de energia elétrica e sua regulação.</w:t>
+        <w:t>Notícia institucional sobre adequação a período eleitoral.</w:t>
       </w:r>
+    </w:p>
+    <w:p>
+      <w:pPr>
+        <w:spacing w:before="240" w:after="80"/>
+      </w:pPr>
+      <w:r>
+        <w:rPr>
+          <w:b/>
+          <w:color w:val="1A4D2E"/>
+          <w:sz w:val="20"/>
+        </w:rPr>
+        <w:t>ONS | NOTÍCIAS</w:t>
+      </w:r>
+    </w:p>
+    <w:p>
+      <w:pPr>
+        <w:spacing w:before="0" w:after="40"/>
+        <w:pBdr>
+          <w:bottom w:val="single" w:sz="8" w:space="1" w:color="1A4D2E"/>
+        </w:pBdr>
+      </w:pPr>
     </w:p>
     <w:p>
       <w:pPr>
@@ -2655,7 +2676,7 @@
           <w:color w:val="1A1A1A"/>
           <w:sz w:val="22"/>
         </w:rPr>
-        <w:t xml:space="preserve">ANEEL e Defesa Civil de SP discutem projeto para enfrentar eventos climáticos extremos   </w:t>
+        <w:t xml:space="preserve">ONS indica afluências acima da Média de Longo Termo na região Sul, com 155%   </w:t>
       </w:r>
       <w:r>
         <w:rPr>
@@ -2675,7 +2696,7 @@
           <w:color w:val="4A4A4A"/>
           <w:sz w:val="20"/>
         </w:rPr>
-        <w:t>ANEEL e Defesa Civil de SP debatem o Projeto SPIN, que visa acelerar as respostas das distribuidoras a eventos climáticos extremos, melhorando a resiliência do sistema.</w:t>
+        <w:t>Previsões no Sudeste/Centro-Oeste também superam 90% da MLT, indicando boas condições hidrológicas.</w:t>
       </w:r>
     </w:p>
     <w:p>
@@ -2695,7 +2716,7 @@
           <w:color w:val="888888"/>
           <w:sz w:val="18"/>
         </w:rPr>
-        <w:t xml:space="preserve">2026-07-02   </w:t>
+        <w:t xml:space="preserve">2026-07-03   </w:t>
       </w:r>
       <w:hyperlink r:id="rId34">
         <w:r>
@@ -2718,8 +2739,29 @@
           <w:color w:val="888888"/>
           <w:sz w:val="16"/>
         </w:rPr>
-        <w:t>Discussão sobre projeto para melhorar a resiliência da rede elétrica a eventos climáticos extremos, com impacto na qualidade do serviço.</w:t>
+        <w:t>Informação relevante sobre condições hidrológicas e operação do sistema elétrico.</w:t>
       </w:r>
+    </w:p>
+    <w:p>
+      <w:pPr>
+        <w:spacing w:before="240" w:after="80"/>
+      </w:pPr>
+      <w:r>
+        <w:rPr>
+          <w:b/>
+          <w:color w:val="1A4D2E"/>
+          <w:sz w:val="20"/>
+        </w:rPr>
+        <w:t>ANEEL | ÚLTIMAS NOTÍCIAS</w:t>
+      </w:r>
+    </w:p>
+    <w:p>
+      <w:pPr>
+        <w:spacing w:before="0" w:after="40"/>
+        <w:pBdr>
+          <w:bottom w:val="single" w:sz="8" w:space="1" w:color="1A4D2E"/>
+        </w:pBdr>
+      </w:pPr>
     </w:p>
     <w:p>
       <w:pPr>
@@ -2731,7 +2773,7 @@
           <w:color w:val="1A1A1A"/>
           <w:sz w:val="22"/>
         </w:rPr>
-        <w:t xml:space="preserve">Projeto Radar da ANEEL fortalece monitoramento e gestão das interrupções de energia no Brasil   </w:t>
+        <w:t xml:space="preserve">Bandeira tarifária em julho permanece amarela   </w:t>
       </w:r>
       <w:r>
         <w:rPr>
@@ -2751,7 +2793,7 @@
           <w:color w:val="4A4A4A"/>
           <w:sz w:val="20"/>
         </w:rPr>
-        <w:t>Projeto Radar da ANEEL aprimora o monitoramento e a gestão de interrupções de energia no Brasil, ampliando a capacidade de fiscalização e resposta da agência.</w:t>
+        <w:t>A conta de luz dos consumidores continua tendo acréscimo de R$ 1,885 a cada 100 kWh em julho.</w:t>
       </w:r>
     </w:p>
     <w:p>
@@ -2771,7 +2813,7 @@
           <w:color w:val="888888"/>
           <w:sz w:val="18"/>
         </w:rPr>
-        <w:t xml:space="preserve">2026-07-02   </w:t>
+        <w:t xml:space="preserve">2026-07-03   </w:t>
       </w:r>
       <w:hyperlink r:id="rId35">
         <w:r>
@@ -2794,7 +2836,7 @@
           <w:color w:val="888888"/>
           <w:sz w:val="16"/>
         </w:rPr>
-        <w:t>Lançamento de projeto para aprimorar o monitoramento da qualidade do serviço de energia elétrica, com impacto na fiscalização.</w:t>
+        <w:t>Impacta diretamente o custo da energia para consumidores.</w:t>
       </w:r>
     </w:p>
     <w:p>
@@ -2807,15 +2849,15 @@
           <w:color w:val="1A1A1A"/>
           <w:sz w:val="22"/>
         </w:rPr>
-        <w:t xml:space="preserve">Blitz da ONEE 2026: Agência realiza ações em duas escolas piauienses para divulgar a maior competição educacional do setor elétrico   </w:t>
+        <w:t xml:space="preserve">Medidores de energia elétrica: ANEEL abre segunda fase da consulta pública   </w:t>
       </w:r>
       <w:r>
         <w:rPr>
           <w:b/>
-          <w:color w:val="7F8C8D"/>
+          <w:color w:val="C0392B"/>
           <w:sz w:val="16"/>
         </w:rPr>
-        <w:t>[BAIXA]</w:t>
+        <w:t>[ALTA]</w:t>
       </w:r>
     </w:p>
     <w:p>
@@ -2827,7 +2869,7 @@
           <w:color w:val="4A4A4A"/>
           <w:sz w:val="20"/>
         </w:rPr>
-        <w:t>A ANEEL realiza a Blitz da ONEE 2026 em escolas do Piauí para divulgar a competição educacional sobre consumo consciente de energia, com atividades para estudantes.</w:t>
+        <w:t>A ANEEL abre a segunda fase da consulta pública para receber sugestões sobre requisitos mínimos em medidores inteligentes de energia elétrica.</w:t>
       </w:r>
     </w:p>
     <w:p>
@@ -2847,7 +2889,7 @@
           <w:color w:val="888888"/>
           <w:sz w:val="18"/>
         </w:rPr>
-        <w:t xml:space="preserve">2026-07-02   </w:t>
+        <w:t xml:space="preserve">2026-07-03   </w:t>
       </w:r>
       <w:hyperlink r:id="rId36">
         <w:r>
@@ -2870,29 +2912,8 @@
           <w:color w:val="888888"/>
           <w:sz w:val="16"/>
         </w:rPr>
-        <w:t>Evento educacional e institucional, sem impacto regulatório ou econômico direto.</w:t>
+        <w:t>Abertura de consulta pública sobre regulamentação técnica com impacto no setor elétrico.</w:t>
       </w:r>
-    </w:p>
-    <w:p>
-      <w:pPr>
-        <w:spacing w:before="240" w:after="80"/>
-      </w:pPr>
-      <w:r>
-        <w:rPr>
-          <w:b/>
-          <w:color w:val="1A4D2E"/>
-          <w:sz w:val="20"/>
-        </w:rPr>
-        <w:t>ANM | NOTÍCIAS</w:t>
-      </w:r>
-    </w:p>
-    <w:p>
-      <w:pPr>
-        <w:spacing w:before="0" w:after="40"/>
-        <w:pBdr>
-          <w:bottom w:val="single" w:sz="8" w:space="1" w:color="1A4D2E"/>
-        </w:pBdr>
-      </w:pPr>
     </w:p>
     <w:p>
       <w:pPr>
@@ -2904,15 +2925,15 @@
           <w:color w:val="1A1A1A"/>
           <w:sz w:val="22"/>
         </w:rPr>
-        <w:t xml:space="preserve">Novo guia orienta usuários sobre como solicitar o Registro de Extração   </w:t>
+        <w:t xml:space="preserve">Olimpíada Nacional de Eficiência Energética 2026 está com inscrições abertas   </w:t>
       </w:r>
       <w:r>
         <w:rPr>
           <w:b/>
-          <w:color w:val="D68910"/>
+          <w:color w:val="7F8C8D"/>
           <w:sz w:val="16"/>
         </w:rPr>
-        <w:t>[MÉDIA]</w:t>
+        <w:t>[BAIXA]</w:t>
       </w:r>
     </w:p>
     <w:p>
@@ -2924,7 +2945,7 @@
           <w:color w:val="4A4A4A"/>
           <w:sz w:val="20"/>
         </w:rPr>
-        <w:t>ANM lança novo guia didático para orientar usuários sobre o processo de solicitação do Registro de Extração de minerais para obras públicas.</w:t>
+        <w:t>A Olimpíada Nacional de Eficiência Energética 2026 está com inscrições abertas, incluindo pela primeira vez estudantes do ensino médio.</w:t>
       </w:r>
     </w:p>
     <w:p>
@@ -2944,7 +2965,7 @@
           <w:color w:val="888888"/>
           <w:sz w:val="18"/>
         </w:rPr>
-        <w:t xml:space="preserve">2026-07-02   </w:t>
+        <w:t xml:space="preserve">2026-07-03   </w:t>
       </w:r>
       <w:hyperlink r:id="rId37">
         <w:r>
@@ -2967,8 +2988,29 @@
           <w:color w:val="888888"/>
           <w:sz w:val="16"/>
         </w:rPr>
-        <w:t>Publicação de guia orientativo sobre procedimento administrativo, relevante para empresas do setor mineral.</w:t>
+        <w:t>Notícia institucional sobre evento educacional.</w:t>
       </w:r>
+    </w:p>
+    <w:p>
+      <w:pPr>
+        <w:spacing w:before="240" w:after="80"/>
+      </w:pPr>
+      <w:r>
+        <w:rPr>
+          <w:b/>
+          <w:color w:val="1A4D2E"/>
+          <w:sz w:val="20"/>
+        </w:rPr>
+        <w:t>ANM | NOTÍCIAS</w:t>
+      </w:r>
+    </w:p>
+    <w:p>
+      <w:pPr>
+        <w:spacing w:before="0" w:after="40"/>
+        <w:pBdr>
+          <w:bottom w:val="single" w:sz="8" w:space="1" w:color="1A4D2E"/>
+        </w:pBdr>
+      </w:pPr>
     </w:p>
     <w:p>
       <w:pPr>
@@ -2980,7 +3022,7 @@
           <w:color w:val="1A1A1A"/>
           <w:sz w:val="22"/>
         </w:rPr>
-        <w:t xml:space="preserve">Conheça as 3 modalidades de fiscalização empreendidas pela agência   </w:t>
+        <w:t xml:space="preserve">Parceria com o Serpro avança em solução para fortalecer a integridade dos royalties da mineração   </w:t>
       </w:r>
       <w:r>
         <w:rPr>
@@ -3000,7 +3042,7 @@
           <w:color w:val="4A4A4A"/>
           <w:sz w:val="20"/>
         </w:rPr>
-        <w:t>ANM detalha suas três modalidades de fiscalização: atividades minerárias, segurança de barragens e arrecadação de royalties, destacando a necessidade de estrutura e recursos.</w:t>
+        <w:t>Oficina discutiu medidas para ampliar compliance, combater concorrência desleal e modernizar a gestão da CFEM.</w:t>
       </w:r>
     </w:p>
     <w:p>
@@ -3020,7 +3062,7 @@
           <w:color w:val="888888"/>
           <w:sz w:val="18"/>
         </w:rPr>
-        <w:t xml:space="preserve">2026-07-02   </w:t>
+        <w:t xml:space="preserve">2026-07-03T18:09   </w:t>
       </w:r>
       <w:hyperlink r:id="rId38">
         <w:r>
@@ -3043,7 +3085,7 @@
           <w:color w:val="888888"/>
           <w:sz w:val="16"/>
         </w:rPr>
-        <w:t>Informações sobre as modalidades de fiscalização da agência, relevante para empresas do setor mineral.</w:t>
+        <w:t>Iniciativa para melhorar a gestão e fiscalização de royalties da mineração.</w:t>
       </w:r>
     </w:p>
     <w:p>
@@ -3077,7 +3119,7 @@
           <w:color w:val="1A1A1A"/>
           <w:sz w:val="22"/>
         </w:rPr>
-        <w:t xml:space="preserve">EPE publica o Relatório Final do Balanço Energético Nacional 2026   </w:t>
+        <w:t xml:space="preserve">EPE e ONS Divulgam Nota Técnica com a Metodologia, Premissas e Critérios para os Leilões de Reserva de Capacidade (LRCAP) de 2026 – Armazenamento Nacional e Armazenamento   </w:t>
       </w:r>
       <w:r>
         <w:rPr>
@@ -3097,7 +3139,7 @@
           <w:color w:val="4A4A4A"/>
           <w:sz w:val="20"/>
         </w:rPr>
-        <w:t>EPE publica o Relatório Final do Balanço Energético Nacional 2026, consolidando a contabilidade da oferta e consumo de energia no Brasil em 2025.</w:t>
+        <w:t>Documento conjunto EPE e ONS apresenta metodologia, premissas e critérios para definição da Capacidade Remanescente do SIN para leilões de reserva de capacidade.</w:t>
       </w:r>
     </w:p>
     <w:p>
@@ -3117,7 +3159,7 @@
           <w:color w:val="888888"/>
           <w:sz w:val="18"/>
         </w:rPr>
-        <w:t xml:space="preserve">2026-07-02   </w:t>
+        <w:t xml:space="preserve">2026-07-03   </w:t>
       </w:r>
       <w:hyperlink r:id="rId39">
         <w:r>
@@ -3140,7 +3182,7 @@
           <w:color w:val="888888"/>
           <w:sz w:val="16"/>
         </w:rPr>
-        <w:t>Publicação de relatório técnico fundamental para o planejamento e análise do setor energético nacional.</w:t>
+        <w:t>Publicação de metodologia e critérios para leilões de energia, com impacto regulatório e de mercado.</w:t>
       </w:r>
     </w:p>
     <w:p>
@@ -3153,7 +3195,7 @@
           <w:color w:val="1A1A1A"/>
           <w:sz w:val="22"/>
         </w:rPr>
-        <w:t xml:space="preserve">EPE publica Informe Trimestral de junho sobre estudos de transmissão previstos em 2026   </w:t>
+        <w:t xml:space="preserve">EPE participa do workshop “Planejamento da Transmissão para a Transição Energética”   </w:t>
       </w:r>
       <w:r>
         <w:rPr>
@@ -3173,7 +3215,7 @@
           <w:color w:val="4A4A4A"/>
           <w:sz w:val="20"/>
         </w:rPr>
-        <w:t>EPE divulga Informe Trimestral de junho sobre o estágio de execução dos estudos de transmissão previstos para 2026, com atualizações de cronograma.</w:t>
+        <w:t>Evento discutiu oportunidades de integração e planejamento de reforços na transmissão, com foco em eficiência e sustentabilidade.</w:t>
       </w:r>
     </w:p>
     <w:p>
@@ -3193,7 +3235,7 @@
           <w:color w:val="888888"/>
           <w:sz w:val="18"/>
         </w:rPr>
-        <w:t xml:space="preserve">2026-07-02   </w:t>
+        <w:t xml:space="preserve">2026-07-03   </w:t>
       </w:r>
       <w:hyperlink r:id="rId40">
         <w:r>
@@ -3216,7 +3258,311 @@
           <w:color w:val="888888"/>
           <w:sz w:val="16"/>
         </w:rPr>
-        <w:t>Publicação de informe técnico sobre estudos de transmissão, relevante para o planejamento da infraestrutura de energia elétrica.</w:t>
+        <w:t>Participação em evento setorial sobre planejamento estratégico de energia.</w:t>
+      </w:r>
+    </w:p>
+    <w:p>
+      <w:pPr>
+        <w:spacing w:before="160" w:after="40"/>
+      </w:pPr>
+      <w:r>
+        <w:rPr>
+          <w:b/>
+          <w:color w:val="1A1A1A"/>
+          <w:sz w:val="22"/>
+        </w:rPr>
+        <w:t xml:space="preserve">Segunda etapa do Leilão de Transmissão nº 1/2026 tem deságio e contrata todos os lotes   </w:t>
+      </w:r>
+      <w:r>
+        <w:rPr>
+          <w:b/>
+          <w:color w:val="C0392B"/>
+          <w:sz w:val="16"/>
+        </w:rPr>
+        <w:t>[ALTA]</w:t>
+      </w:r>
+    </w:p>
+    <w:p>
+      <w:pPr>
+        <w:spacing w:after="40"/>
+      </w:pPr>
+      <w:r>
+        <w:rPr>
+          <w:color w:val="4A4A4A"/>
+          <w:sz w:val="20"/>
+        </w:rPr>
+        <w:t>Leilão de Transmissão com quatro lotes e investimentos de R$ 1,8 bilhão teve 100% de sucesso, com deságio.</w:t>
+      </w:r>
+    </w:p>
+    <w:p>
+      <w:pPr>
+        <w:spacing w:after="40"/>
+      </w:pPr>
+      <w:r>
+        <w:rPr>
+          <w:b/>
+          <w:color w:val="888888"/>
+          <w:sz w:val="18"/>
+        </w:rPr>
+        <w:t xml:space="preserve">Publicado: </w:t>
+      </w:r>
+      <w:r>
+        <w:rPr>
+          <w:color w:val="888888"/>
+          <w:sz w:val="18"/>
+        </w:rPr>
+        <w:t xml:space="preserve">2026-07-03   </w:t>
+      </w:r>
+      <w:hyperlink r:id="rId41">
+        <w:r>
+          <w:rPr>
+            <w:color w:val="1A4D2E"/>
+            <w:u w:val="single"/>
+            <w:b/>
+          </w:rPr>
+          <w:t>Acessar materia</w:t>
+        </w:r>
+      </w:hyperlink>
+    </w:p>
+    <w:p>
+      <w:pPr>
+        <w:spacing w:after="120"/>
+      </w:pPr>
+      <w:r>
+        <w:rPr>
+          <w:i/>
+          <w:color w:val="888888"/>
+          <w:sz w:val="16"/>
+        </w:rPr>
+        <w:t>Resultado de leilão de infraestrutura energética com grande volume de investimentos.</w:t>
+      </w:r>
+    </w:p>
+    <w:p>
+      <w:pPr>
+        <w:spacing w:before="160" w:after="40"/>
+      </w:pPr>
+      <w:r>
+        <w:rPr>
+          <w:b/>
+          <w:color w:val="1A1A1A"/>
+          <w:sz w:val="22"/>
+        </w:rPr>
+        <w:t xml:space="preserve">EPE recebe prêmio por excelência em planejamento energético durante o EVEx Brasil 2026   </w:t>
+      </w:r>
+      <w:r>
+        <w:rPr>
+          <w:b/>
+          <w:color w:val="7F8C8D"/>
+          <w:sz w:val="16"/>
+        </w:rPr>
+        <w:t>[BAIXA]</w:t>
+      </w:r>
+    </w:p>
+    <w:p>
+      <w:pPr>
+        <w:spacing w:after="40"/>
+      </w:pPr>
+      <w:r>
+        <w:rPr>
+          <w:color w:val="4A4A4A"/>
+          <w:sz w:val="20"/>
+        </w:rPr>
+        <w:t>A EPE foi premiada com "Vanguarda em Planejamento e Inteligência Setorial" no EVEx Brasil 2026, reconhecendo sua excelência técnica.</w:t>
+      </w:r>
+    </w:p>
+    <w:p>
+      <w:pPr>
+        <w:spacing w:after="40"/>
+      </w:pPr>
+      <w:r>
+        <w:rPr>
+          <w:b/>
+          <w:color w:val="888888"/>
+          <w:sz w:val="18"/>
+        </w:rPr>
+        <w:t xml:space="preserve">Publicado: </w:t>
+      </w:r>
+      <w:r>
+        <w:rPr>
+          <w:color w:val="888888"/>
+          <w:sz w:val="18"/>
+        </w:rPr>
+        <w:t xml:space="preserve">2026-07-03   </w:t>
+      </w:r>
+      <w:hyperlink r:id="rId42">
+        <w:r>
+          <w:rPr>
+            <w:color w:val="1A4D2E"/>
+            <w:u w:val="single"/>
+            <w:b/>
+          </w:rPr>
+          <w:t>Acessar materia</w:t>
+        </w:r>
+      </w:hyperlink>
+    </w:p>
+    <w:p>
+      <w:pPr>
+        <w:spacing w:after="120"/>
+      </w:pPr>
+      <w:r>
+        <w:rPr>
+          <w:i/>
+          <w:color w:val="888888"/>
+          <w:sz w:val="16"/>
+        </w:rPr>
+        <w:t>Notícia institucional sobre premiação.</w:t>
+      </w:r>
+    </w:p>
+    <w:p>
+      <w:pPr>
+        <w:spacing w:before="160" w:after="40"/>
+      </w:pPr>
+      <w:r>
+        <w:rPr>
+          <w:b/>
+          <w:color w:val="1A1A1A"/>
+          <w:sz w:val="22"/>
+        </w:rPr>
+        <w:t xml:space="preserve">EPE publica Rodadas de Licitação no Mundo em 2026   </w:t>
+      </w:r>
+      <w:r>
+        <w:rPr>
+          <w:b/>
+          <w:color w:val="D68910"/>
+          <w:sz w:val="16"/>
+        </w:rPr>
+        <w:t>[MÉDIA]</w:t>
+      </w:r>
+    </w:p>
+    <w:p>
+      <w:pPr>
+        <w:spacing w:after="40"/>
+      </w:pPr>
+      <w:r>
+        <w:rPr>
+          <w:color w:val="4A4A4A"/>
+          <w:sz w:val="20"/>
+        </w:rPr>
+        <w:t>Documento reúne informações sobre rodadas de licitação de áreas exploratórias em 2025 e 2026, destacando estratégias de segurança energética.</w:t>
+      </w:r>
+    </w:p>
+    <w:p>
+      <w:pPr>
+        <w:spacing w:after="40"/>
+      </w:pPr>
+      <w:r>
+        <w:rPr>
+          <w:b/>
+          <w:color w:val="888888"/>
+          <w:sz w:val="18"/>
+        </w:rPr>
+        <w:t xml:space="preserve">Publicado: </w:t>
+      </w:r>
+      <w:r>
+        <w:rPr>
+          <w:color w:val="888888"/>
+          <w:sz w:val="18"/>
+        </w:rPr>
+        <w:t xml:space="preserve">2026-07-03   </w:t>
+      </w:r>
+      <w:hyperlink r:id="rId43">
+        <w:r>
+          <w:rPr>
+            <w:color w:val="1A4D2E"/>
+            <w:u w:val="single"/>
+            <w:b/>
+          </w:rPr>
+          <w:t>Acessar materia</w:t>
+        </w:r>
+      </w:hyperlink>
+    </w:p>
+    <w:p>
+      <w:pPr>
+        <w:spacing w:after="120"/>
+      </w:pPr>
+      <w:r>
+        <w:rPr>
+          <w:i/>
+          <w:color w:val="888888"/>
+          <w:sz w:val="16"/>
+        </w:rPr>
+        <w:t>Publicação de estudo relevante para o setor de petróleo e gás.</w:t>
+      </w:r>
+    </w:p>
+    <w:p>
+      <w:pPr>
+        <w:spacing w:before="160" w:after="40"/>
+      </w:pPr>
+      <w:r>
+        <w:rPr>
+          <w:b/>
+          <w:color w:val="1A1A1A"/>
+          <w:sz w:val="22"/>
+        </w:rPr>
+        <w:t xml:space="preserve">Primeiro caderno do PDE 2036 reúne contexto, perspectivas e premissas para o setor energético   </w:t>
+      </w:r>
+      <w:r>
+        <w:rPr>
+          <w:b/>
+          <w:color w:val="D68910"/>
+          <w:sz w:val="16"/>
+        </w:rPr>
+        <w:t>[MÉDIA]</w:t>
+      </w:r>
+    </w:p>
+    <w:p>
+      <w:pPr>
+        <w:spacing w:after="40"/>
+      </w:pPr>
+      <w:r>
+        <w:rPr>
+          <w:color w:val="4A4A4A"/>
+          <w:sz w:val="20"/>
+        </w:rPr>
+        <w:t>MME e EPE publicaram o Caderno de Contexto, Perspectivas e Premissas, primeira publicação do Plano Decenal de Expansão de Energia 2036.</w:t>
+      </w:r>
+    </w:p>
+    <w:p>
+      <w:pPr>
+        <w:spacing w:after="40"/>
+      </w:pPr>
+      <w:r>
+        <w:rPr>
+          <w:b/>
+          <w:color w:val="888888"/>
+          <w:sz w:val="18"/>
+        </w:rPr>
+        <w:t xml:space="preserve">Publicado: </w:t>
+      </w:r>
+      <w:r>
+        <w:rPr>
+          <w:color w:val="888888"/>
+          <w:sz w:val="18"/>
+        </w:rPr>
+        <w:t xml:space="preserve">2026-07-03   </w:t>
+      </w:r>
+      <w:hyperlink r:id="rId44">
+        <w:r>
+          <w:rPr>
+            <w:color w:val="1A4D2E"/>
+            <w:u w:val="single"/>
+            <w:b/>
+          </w:rPr>
+          <w:t>Acessar materia</w:t>
+        </w:r>
+      </w:hyperlink>
+    </w:p>
+    <w:p>
+      <w:pPr>
+        <w:spacing w:after="120"/>
+      </w:pPr>
+      <w:r>
+        <w:rPr>
+          <w:i/>
+          <w:color w:val="888888"/>
+          <w:sz w:val="16"/>
+        </w:rPr>
+        <w:t>Publicação de estudo estratégico para o planejamento energético nacional.</w:t>
       </w:r>
     </w:p>
     <w:p/>
@@ -3261,7 +3607,7 @@
           <w:color w:val="1A4D2E"/>
           <w:sz w:val="20"/>
         </w:rPr>
-        <w:t>MINISTÉRIO DO MEIO AMBIENTE | NOTÍCIAS</w:t>
+        <w:t>MINISTÉRIO DA AGRICULTURA | NOTÍCIAS</w:t>
       </w:r>
     </w:p>
     <w:p>
@@ -3282,15 +3628,15 @@
           <w:color w:val="1A1A1A"/>
           <w:sz w:val="22"/>
         </w:rPr>
-        <w:t xml:space="preserve">Trilha Amazônia Atlântica passa a contar com 1.000 quilômetros totalmente sinalizados entre o Pará e o Maranhão   </w:t>
+        <w:t xml:space="preserve">.   </w:t>
       </w:r>
       <w:r>
         <w:rPr>
           <w:b/>
-          <w:color w:val="D68910"/>
+          <w:color w:val="7F8C8D"/>
           <w:sz w:val="16"/>
         </w:rPr>
-        <w:t>[MÉDIA]</w:t>
+        <w:t>[BAIXA]</w:t>
       </w:r>
     </w:p>
     <w:p>
@@ -3302,7 +3648,7 @@
           <w:color w:val="4A4A4A"/>
           <w:sz w:val="20"/>
         </w:rPr>
-        <w:t>A Trilha Amazônia Atlântica atinge 1.000 km sinalizados, conectando unidades de conservação e impulsionando o turismo de natureza e desenvolvimento local entre Pará e Maranhão.</w:t>
+        <w:t>Comunicado sobre o período de defeso eleitoral, com imagem ilustrativa.</w:t>
       </w:r>
     </w:p>
     <w:p>
@@ -3322,311 +3668,7 @@
           <w:color w:val="888888"/>
           <w:sz w:val="18"/>
         </w:rPr>
-        <w:t xml:space="preserve">2026-07-02T18:52   </w:t>
-      </w:r>
-      <w:hyperlink r:id="rId41">
-        <w:r>
-          <w:rPr>
-            <w:color w:val="1A4D2E"/>
-            <w:u w:val="single"/>
-            <w:b/>
-          </w:rPr>
-          <w:t>Acessar materia</w:t>
-        </w:r>
-      </w:hyperlink>
-    </w:p>
-    <w:p>
-      <w:pPr>
-        <w:spacing w:after="120"/>
-      </w:pPr>
-      <w:r>
-        <w:rPr>
-          <w:i/>
-          <w:color w:val="888888"/>
-          <w:sz w:val="16"/>
-        </w:rPr>
-        <w:t>Iniciativa de conservação ambiental e fomento ao turismo, com impacto regional.</w:t>
-      </w:r>
-    </w:p>
-    <w:p>
-      <w:pPr>
-        <w:spacing w:before="160" w:after="40"/>
-      </w:pPr>
-      <w:r>
-        <w:rPr>
-          <w:b/>
-          <w:color w:val="1A1A1A"/>
-          <w:sz w:val="22"/>
-        </w:rPr>
-        <w:t xml:space="preserve">Delegação brasileira rumo à COP17 na Mongólia: país apresentará metas de resiliência e mitigação à seca   </w:t>
-      </w:r>
-      <w:r>
-        <w:rPr>
-          <w:b/>
-          <w:color w:val="C0392B"/>
-          <w:sz w:val="16"/>
-        </w:rPr>
-        <w:t>[ALTA]</w:t>
-      </w:r>
-    </w:p>
-    <w:p>
-      <w:pPr>
-        <w:spacing w:after="40"/>
-      </w:pPr>
-      <w:r>
-        <w:rPr>
-          <w:color w:val="4A4A4A"/>
-          <w:sz w:val="20"/>
-        </w:rPr>
-        <w:t>Delegação brasileira na COP17 apresentará metas de Neutralidade de Degradação da Terra (LDNs) e o Programa Recaatingar, focando em resiliência e mitigação à seca.</w:t>
-      </w:r>
-    </w:p>
-    <w:p>
-      <w:pPr>
-        <w:spacing w:after="40"/>
-      </w:pPr>
-      <w:r>
-        <w:rPr>
-          <w:b/>
-          <w:color w:val="888888"/>
-          <w:sz w:val="18"/>
-        </w:rPr>
-        <w:t xml:space="preserve">Publicado: </w:t>
-      </w:r>
-      <w:r>
-        <w:rPr>
-          <w:color w:val="888888"/>
-          <w:sz w:val="18"/>
-        </w:rPr>
-        <w:t xml:space="preserve">2026-07-02T17:48   </w:t>
-      </w:r>
-      <w:hyperlink r:id="rId42">
-        <w:r>
-          <w:rPr>
-            <w:color w:val="1A4D2E"/>
-            <w:u w:val="single"/>
-            <w:b/>
-          </w:rPr>
-          <w:t>Acessar materia</w:t>
-        </w:r>
-      </w:hyperlink>
-    </w:p>
-    <w:p>
-      <w:pPr>
-        <w:spacing w:after="120"/>
-      </w:pPr>
-      <w:r>
-        <w:rPr>
-          <w:i/>
-          <w:color w:val="888888"/>
-          <w:sz w:val="16"/>
-        </w:rPr>
-        <w:t>Participação em conferência climática internacional com apresentação de metas nacionais, relevante para políticas ambientais e compromissos globais.</w:t>
-      </w:r>
-    </w:p>
-    <w:p>
-      <w:pPr>
-        <w:spacing w:before="160" w:after="40"/>
-      </w:pPr>
-      <w:r>
-        <w:rPr>
-          <w:b/>
-          <w:color w:val="1A1A1A"/>
-          <w:sz w:val="22"/>
-        </w:rPr>
-        <w:t xml:space="preserve">Novas prefeituras do bioma Amazônia podem aderir ao Programa União com Municípios   </w:t>
-      </w:r>
-      <w:r>
-        <w:rPr>
-          <w:b/>
-          <w:color w:val="C0392B"/>
-          <w:sz w:val="16"/>
-        </w:rPr>
-        <w:t>[ALTA]</w:t>
-      </w:r>
-    </w:p>
-    <w:p>
-      <w:pPr>
-        <w:spacing w:after="40"/>
-      </w:pPr>
-      <w:r>
-        <w:rPr>
-          <w:color w:val="4A4A4A"/>
-          <w:sz w:val="20"/>
-        </w:rPr>
-        <w:t>Novas prefeituras da Amazônia podem aderir ao Programa União com Municípios, que oferece mais de R$ 800 milhões para prevenção e controle do desmatamento, ampliando o alcance para 89 municípios.</w:t>
-      </w:r>
-    </w:p>
-    <w:p>
-      <w:pPr>
-        <w:spacing w:after="40"/>
-      </w:pPr>
-      <w:r>
-        <w:rPr>
-          <w:b/>
-          <w:color w:val="888888"/>
-          <w:sz w:val="18"/>
-        </w:rPr>
-        <w:t xml:space="preserve">Publicado: </w:t>
-      </w:r>
-      <w:r>
-        <w:rPr>
-          <w:color w:val="888888"/>
-          <w:sz w:val="18"/>
-        </w:rPr>
-        <w:t xml:space="preserve">2026-07-02T16:16   </w:t>
-      </w:r>
-      <w:hyperlink r:id="rId43">
-        <w:r>
-          <w:rPr>
-            <w:color w:val="1A4D2E"/>
-            <w:u w:val="single"/>
-            <w:b/>
-          </w:rPr>
-          <w:t>Acessar materia</w:t>
-        </w:r>
-      </w:hyperlink>
-    </w:p>
-    <w:p>
-      <w:pPr>
-        <w:spacing w:after="120"/>
-      </w:pPr>
-      <w:r>
-        <w:rPr>
-          <w:i/>
-          <w:color w:val="888888"/>
-          <w:sz w:val="16"/>
-        </w:rPr>
-        <w:t>Programa governamental com grande investimento para combate ao desmatamento, com impacto direto em municípios da Amazônia.</w:t>
-      </w:r>
-    </w:p>
-    <w:p>
-      <w:pPr>
-        <w:spacing w:before="160" w:after="40"/>
-      </w:pPr>
-      <w:r>
-        <w:rPr>
-          <w:b/>
-          <w:color w:val="1A1A1A"/>
-          <w:sz w:val="22"/>
-        </w:rPr>
-        <w:t xml:space="preserve">Plataforma Brasil Mais Verde é lançada com pacote de medidas para fortalecer a sociobioeconomia e a conservação ambiental   </w:t>
-      </w:r>
-      <w:r>
-        <w:rPr>
-          <w:b/>
-          <w:color w:val="C0392B"/>
-          <w:sz w:val="16"/>
-        </w:rPr>
-        <w:t>[ALTA]</w:t>
-      </w:r>
-    </w:p>
-    <w:p>
-      <w:pPr>
-        <w:spacing w:after="40"/>
-      </w:pPr>
-      <w:r>
-        <w:rPr>
-          <w:color w:val="4A4A4A"/>
-          <w:sz w:val="20"/>
-        </w:rPr>
-        <w:t>Lançamento da Plataforma Brasil Mais Verde com medidas para fortalecer a sociobioeconomia e conservação ambiental, ampliando investimentos e acesso a crédito para comunidades tradicionais.</w:t>
-      </w:r>
-    </w:p>
-    <w:p>
-      <w:pPr>
-        <w:spacing w:after="40"/>
-      </w:pPr>
-      <w:r>
-        <w:rPr>
-          <w:b/>
-          <w:color w:val="888888"/>
-          <w:sz w:val="18"/>
-        </w:rPr>
-        <w:t xml:space="preserve">Publicado: </w:t>
-      </w:r>
-      <w:r>
-        <w:rPr>
-          <w:color w:val="888888"/>
-          <w:sz w:val="18"/>
-        </w:rPr>
-        <w:t xml:space="preserve">2026-07-02T14:39   </w:t>
-      </w:r>
-      <w:hyperlink r:id="rId44">
-        <w:r>
-          <w:rPr>
-            <w:color w:val="1A4D2E"/>
-            <w:u w:val="single"/>
-            <w:b/>
-          </w:rPr>
-          <w:t>Acessar materia</w:t>
-        </w:r>
-      </w:hyperlink>
-    </w:p>
-    <w:p>
-      <w:pPr>
-        <w:spacing w:after="120"/>
-      </w:pPr>
-      <w:r>
-        <w:rPr>
-          <w:i/>
-          <w:color w:val="888888"/>
-          <w:sz w:val="16"/>
-        </w:rPr>
-        <w:t>Lançamento de plataforma e pacote de medidas para bioeconomia e conservação, com amplo impacto econômico e social.</w:t>
-      </w:r>
-    </w:p>
-    <w:p>
-      <w:pPr>
-        <w:spacing w:before="160" w:after="40"/>
-      </w:pPr>
-      <w:r>
-        <w:rPr>
-          <w:b/>
-          <w:color w:val="1A1A1A"/>
-          <w:sz w:val="22"/>
-        </w:rPr>
-        <w:t xml:space="preserve">Esperançar Chico Mendes forma brigadas comunitárias para o Manejo Integrado do Fogo na Resex Chico Mendes   </w:t>
-      </w:r>
-      <w:r>
-        <w:rPr>
-          <w:b/>
-          <w:color w:val="D68910"/>
-          <w:sz w:val="16"/>
-        </w:rPr>
-        <w:t>[MÉDIA]</w:t>
-      </w:r>
-    </w:p>
-    <w:p>
-      <w:pPr>
-        <w:spacing w:after="40"/>
-      </w:pPr>
-      <w:r>
-        <w:rPr>
-          <w:color w:val="4A4A4A"/>
-          <w:sz w:val="20"/>
-        </w:rPr>
-        <w:t>Iniciativa 'Esperançar Chico Mendes' capacita 120 moradores da Resex Chico Mendes no Acre para o Manejo Integrado do Fogo, combinando ciência e práticas tradicionais contra mudanças climáticas.</w:t>
-      </w:r>
-    </w:p>
-    <w:p>
-      <w:pPr>
-        <w:spacing w:after="40"/>
-      </w:pPr>
-      <w:r>
-        <w:rPr>
-          <w:b/>
-          <w:color w:val="888888"/>
-          <w:sz w:val="18"/>
-        </w:rPr>
-        <w:t xml:space="preserve">Publicado: </w:t>
-      </w:r>
-      <w:r>
-        <w:rPr>
-          <w:color w:val="888888"/>
-          <w:sz w:val="18"/>
-        </w:rPr>
-        <w:t xml:space="preserve">2026-07-02T17:06   </w:t>
+        <w:t xml:space="preserve">2026-07-03   </w:t>
       </w:r>
       <w:hyperlink r:id="rId45">
         <w:r>
@@ -3649,636 +3691,7 @@
           <w:color w:val="888888"/>
           <w:sz w:val="16"/>
         </w:rPr>
-        <w:t>Programa de capacitação comunitária para manejo ambiental, relevante para a gestão de recursos naturais e adaptação climática.</w:t>
-      </w:r>
-    </w:p>
-    <w:p>
-      <w:pPr>
-        <w:spacing w:before="160" w:after="40"/>
-      </w:pPr>
-      <w:r>
-        <w:rPr>
-          <w:b/>
-          <w:color w:val="1A1A1A"/>
-          <w:sz w:val="22"/>
-        </w:rPr>
-        <w:t xml:space="preserve">Governo do Brasil lança chamada pública para reconhecer povos e comunidades tradicionais que conservam a floresta na Amazônia   </w:t>
-      </w:r>
-      <w:r>
-        <w:rPr>
-          <w:b/>
-          <w:color w:val="D68910"/>
-          <w:sz w:val="16"/>
-        </w:rPr>
-        <w:t>[MÉDIA]</w:t>
-      </w:r>
-    </w:p>
-    <w:p>
-      <w:pPr>
-        <w:spacing w:after="40"/>
-      </w:pPr>
-      <w:r>
-        <w:rPr>
-          <w:color w:val="4A4A4A"/>
-          <w:sz w:val="20"/>
-        </w:rPr>
-        <w:t>Chamada pública do Projeto Floresta+ Amazônia para reconhecer e pagar até R$ 8 mil a famílias de povos e comunidades tradicionais que conservam a floresta no Amazonas e Rondônia.</w:t>
-      </w:r>
-    </w:p>
-    <w:p>
-      <w:pPr>
-        <w:spacing w:after="40"/>
-      </w:pPr>
-      <w:r>
-        <w:rPr>
-          <w:b/>
-          <w:color w:val="888888"/>
-          <w:sz w:val="18"/>
-        </w:rPr>
-        <w:t xml:space="preserve">Publicado: </w:t>
-      </w:r>
-      <w:r>
-        <w:rPr>
-          <w:color w:val="888888"/>
-          <w:sz w:val="18"/>
-        </w:rPr>
-        <w:t xml:space="preserve">2026-07-02T15:56   </w:t>
-      </w:r>
-      <w:hyperlink r:id="rId46">
-        <w:r>
-          <w:rPr>
-            <w:color w:val="1A4D2E"/>
-            <w:u w:val="single"/>
-            <w:b/>
-          </w:rPr>
-          <w:t>Acessar materia</w:t>
-        </w:r>
-      </w:hyperlink>
-    </w:p>
-    <w:p>
-      <w:pPr>
-        <w:spacing w:after="120"/>
-      </w:pPr>
-      <w:r>
-        <w:rPr>
-          <w:i/>
-          <w:color w:val="888888"/>
-          <w:sz w:val="16"/>
-        </w:rPr>
-        <w:t>Iniciativa de apoio financeiro a comunidades tradicionais pela conservação ambiental, com impacto social e ecológico.</w:t>
-      </w:r>
-    </w:p>
-    <w:p>
-      <w:pPr>
-        <w:spacing w:before="160" w:after="40"/>
-      </w:pPr>
-      <w:r>
-        <w:rPr>
-          <w:b/>
-          <w:color w:val="1A1A1A"/>
-          <w:sz w:val="22"/>
-        </w:rPr>
-        <w:t xml:space="preserve">Governo do Brasil realiza 2ª reunião da Sala de Situação sobre Incêndios Florestais   </w:t>
-      </w:r>
-      <w:r>
-        <w:rPr>
-          <w:b/>
-          <w:color w:val="D68910"/>
-          <w:sz w:val="16"/>
-        </w:rPr>
-        <w:t>[MÉDIA]</w:t>
-      </w:r>
-    </w:p>
-    <w:p>
-      <w:pPr>
-        <w:spacing w:after="40"/>
-      </w:pPr>
-      <w:r>
-        <w:rPr>
-          <w:color w:val="4A4A4A"/>
-          <w:sz w:val="20"/>
-        </w:rPr>
-        <w:t>2ª reunião interministerial da Sala de Situação sobre Incêndios Florestais discute medidas preventivas para reduzir impactos da temporada de incêndios de 2026.</w:t>
-      </w:r>
-    </w:p>
-    <w:p>
-      <w:pPr>
-        <w:spacing w:after="40"/>
-      </w:pPr>
-      <w:r>
-        <w:rPr>
-          <w:b/>
-          <w:color w:val="888888"/>
-          <w:sz w:val="18"/>
-        </w:rPr>
-        <w:t xml:space="preserve">Publicado: </w:t>
-      </w:r>
-      <w:r>
-        <w:rPr>
-          <w:color w:val="888888"/>
-          <w:sz w:val="18"/>
-        </w:rPr>
-        <w:t xml:space="preserve">2026-07-02T11:48   </w:t>
-      </w:r>
-      <w:hyperlink r:id="rId47">
-        <w:r>
-          <w:rPr>
-            <w:color w:val="1A4D2E"/>
-            <w:u w:val="single"/>
-            <w:b/>
-          </w:rPr>
-          <w:t>Acessar materia</w:t>
-        </w:r>
-      </w:hyperlink>
-    </w:p>
-    <w:p>
-      <w:pPr>
-        <w:spacing w:after="120"/>
-      </w:pPr>
-      <w:r>
-        <w:rPr>
-          <w:i/>
-          <w:color w:val="888888"/>
-          <w:sz w:val="16"/>
-        </w:rPr>
-        <w:t>Reunião de coordenação governamental para prevenção de incêndios florestais, relevante para gestão ambiental e segurança.</w:t>
-      </w:r>
-    </w:p>
-    <w:p>
-      <w:pPr>
-        <w:spacing w:before="240" w:after="80"/>
-      </w:pPr>
-      <w:r>
-        <w:rPr>
-          <w:b/>
-          <w:color w:val="1A4D2E"/>
-          <w:sz w:val="20"/>
-        </w:rPr>
-        <w:t>MINISTÉRIO DA AGRICULTURA | NOTÍCIAS</w:t>
-      </w:r>
-    </w:p>
-    <w:p>
-      <w:pPr>
-        <w:spacing w:before="0" w:after="40"/>
-        <w:pBdr>
-          <w:bottom w:val="single" w:sz="8" w:space="1" w:color="1A4D2E"/>
-        </w:pBdr>
-      </w:pPr>
-    </w:p>
-    <w:p>
-      <w:pPr>
-        <w:spacing w:before="160" w:after="40"/>
-      </w:pPr>
-      <w:r>
-        <w:rPr>
-          <w:b/>
-          <w:color w:val="1A1A1A"/>
-          <w:sz w:val="22"/>
-        </w:rPr>
-        <w:t xml:space="preserve">Aberturas de mercado para o Brasil na Malásia, no Quênia e na Turquia   </w:t>
-      </w:r>
-      <w:r>
-        <w:rPr>
-          <w:b/>
-          <w:color w:val="C0392B"/>
-          <w:sz w:val="16"/>
-        </w:rPr>
-        <w:t>[ALTA]</w:t>
-      </w:r>
-    </w:p>
-    <w:p>
-      <w:pPr>
-        <w:spacing w:after="40"/>
-      </w:pPr>
-      <w:r>
-        <w:rPr>
-          <w:color w:val="4A4A4A"/>
-          <w:sz w:val="20"/>
-        </w:rPr>
-        <w:t>Brasil conquista 651 aberturas de mercado para o agronegócio desde 2023, com novos anúncios na Malásia, Quênia e Turquia, impulsionando exportações.</w:t>
-      </w:r>
-    </w:p>
-    <w:p>
-      <w:pPr>
-        <w:spacing w:after="40"/>
-      </w:pPr>
-      <w:r>
-        <w:rPr>
-          <w:b/>
-          <w:color w:val="888888"/>
-          <w:sz w:val="18"/>
-        </w:rPr>
-        <w:t xml:space="preserve">Publicado: </w:t>
-      </w:r>
-      <w:r>
-        <w:rPr>
-          <w:color w:val="888888"/>
-          <w:sz w:val="18"/>
-        </w:rPr>
-        <w:t xml:space="preserve">2026-07-02   </w:t>
-      </w:r>
-      <w:hyperlink r:id="rId48">
-        <w:r>
-          <w:rPr>
-            <w:color w:val="1A4D2E"/>
-            <w:u w:val="single"/>
-            <w:b/>
-          </w:rPr>
-          <w:t>Acessar materia</w:t>
-        </w:r>
-      </w:hyperlink>
-    </w:p>
-    <w:p>
-      <w:pPr>
-        <w:spacing w:after="120"/>
-      </w:pPr>
-      <w:r>
-        <w:rPr>
-          <w:i/>
-          <w:color w:val="888888"/>
-          <w:sz w:val="16"/>
-        </w:rPr>
-        <w:t>Abertura de novos mercados para o agronegócio brasileiro, com impacto econômico significativo para o setor.</w:t>
-      </w:r>
-    </w:p>
-    <w:p>
-      <w:pPr>
-        <w:spacing w:before="160" w:after="40"/>
-      </w:pPr>
-      <w:r>
-        <w:rPr>
-          <w:b/>
-          <w:color w:val="1A1A1A"/>
-          <w:sz w:val="22"/>
-        </w:rPr>
-        <w:t xml:space="preserve">Ratificação do Acordo de Livre Comércio entre MERCOSUL e EFTA   </w:t>
-      </w:r>
-      <w:r>
-        <w:rPr>
-          <w:b/>
-          <w:color w:val="C0392B"/>
-          <w:sz w:val="16"/>
-        </w:rPr>
-        <w:t>[ALTA]</w:t>
-      </w:r>
-    </w:p>
-    <w:p>
-      <w:pPr>
-        <w:spacing w:after="40"/>
-      </w:pPr>
-      <w:r>
-        <w:rPr>
-          <w:color w:val="4A4A4A"/>
-          <w:sz w:val="20"/>
-        </w:rPr>
-        <w:t>Ratificação do Acordo de Livre Comércio entre MERCOSUL e EFTA, criando um mercado de mais de 280 milhões de consumidores e impulsionando o comércio.</w:t>
-      </w:r>
-    </w:p>
-    <w:p>
-      <w:pPr>
-        <w:spacing w:after="40"/>
-      </w:pPr>
-      <w:r>
-        <w:rPr>
-          <w:b/>
-          <w:color w:val="888888"/>
-          <w:sz w:val="18"/>
-        </w:rPr>
-        <w:t xml:space="preserve">Publicado: </w:t>
-      </w:r>
-      <w:r>
-        <w:rPr>
-          <w:color w:val="888888"/>
-          <w:sz w:val="18"/>
-        </w:rPr>
-        <w:t xml:space="preserve">2026-07-02   </w:t>
-      </w:r>
-      <w:hyperlink r:id="rId49">
-        <w:r>
-          <w:rPr>
-            <w:color w:val="1A4D2E"/>
-            <w:u w:val="single"/>
-            <w:b/>
-          </w:rPr>
-          <w:t>Acessar materia</w:t>
-        </w:r>
-      </w:hyperlink>
-    </w:p>
-    <w:p>
-      <w:pPr>
-        <w:spacing w:after="120"/>
-      </w:pPr>
-      <w:r>
-        <w:rPr>
-          <w:i/>
-          <w:color w:val="888888"/>
-          <w:sz w:val="16"/>
-        </w:rPr>
-        <w:t>Ratificação de acordo de livre comércio, com impacto direto nas relações comerciais e econômicas do Brasil.</w:t>
-      </w:r>
-    </w:p>
-    <w:p>
-      <w:pPr>
-        <w:spacing w:before="160" w:after="40"/>
-      </w:pPr>
-      <w:r>
-        <w:rPr>
-          <w:b/>
-          <w:color w:val="1A1A1A"/>
-          <w:sz w:val="22"/>
-        </w:rPr>
-        <w:t xml:space="preserve">Ratificação do Acordo de Livre Comércio entre MERCOSUL e Singapura   </w:t>
-      </w:r>
-      <w:r>
-        <w:rPr>
-          <w:b/>
-          <w:color w:val="C0392B"/>
-          <w:sz w:val="16"/>
-        </w:rPr>
-        <w:t>[ALTA]</w:t>
-      </w:r>
-    </w:p>
-    <w:p>
-      <w:pPr>
-        <w:spacing w:after="40"/>
-      </w:pPr>
-      <w:r>
-        <w:rPr>
-          <w:color w:val="4A4A4A"/>
-          <w:sz w:val="20"/>
-        </w:rPr>
-        <w:t>Ratificação do primeiro acordo de livre comércio do MERCOSUL com um país do Sudeste Asiático (Singapura), abrindo novas oportunidades comerciais.</w:t>
-      </w:r>
-    </w:p>
-    <w:p>
-      <w:pPr>
-        <w:spacing w:after="40"/>
-      </w:pPr>
-      <w:r>
-        <w:rPr>
-          <w:b/>
-          <w:color w:val="888888"/>
-          <w:sz w:val="18"/>
-        </w:rPr>
-        <w:t xml:space="preserve">Publicado: </w:t>
-      </w:r>
-      <w:r>
-        <w:rPr>
-          <w:color w:val="888888"/>
-          <w:sz w:val="18"/>
-        </w:rPr>
-        <w:t xml:space="preserve">2026-07-02   </w:t>
-      </w:r>
-      <w:hyperlink r:id="rId50">
-        <w:r>
-          <w:rPr>
-            <w:color w:val="1A4D2E"/>
-            <w:u w:val="single"/>
-            <w:b/>
-          </w:rPr>
-          <w:t>Acessar materia</w:t>
-        </w:r>
-      </w:hyperlink>
-    </w:p>
-    <w:p>
-      <w:pPr>
-        <w:spacing w:after="120"/>
-      </w:pPr>
-      <w:r>
-        <w:rPr>
-          <w:i/>
-          <w:color w:val="888888"/>
-          <w:sz w:val="16"/>
-        </w:rPr>
-        <w:t>Ratificação de acordo de livre comércio, com impacto direto nas relações comerciais e econômicas do Brasil, especialmente com o Sudeste Asiático.</w:t>
-      </w:r>
-    </w:p>
-    <w:p>
-      <w:pPr>
-        <w:spacing w:before="160" w:after="40"/>
-      </w:pPr>
-      <w:r>
-        <w:rPr>
-          <w:b/>
-          <w:color w:val="1A1A1A"/>
-          <w:sz w:val="22"/>
-        </w:rPr>
-        <w:t xml:space="preserve">Governo Federal democratiza o acesso ao Move Agricultura com crédito para pessoas físicas   </w:t>
-      </w:r>
-      <w:r>
-        <w:rPr>
-          <w:b/>
-          <w:color w:val="C0392B"/>
-          <w:sz w:val="16"/>
-        </w:rPr>
-        <w:t>[ALTA]</w:t>
-      </w:r>
-    </w:p>
-    <w:p>
-      <w:pPr>
-        <w:spacing w:after="40"/>
-      </w:pPr>
-      <w:r>
-        <w:rPr>
-          <w:color w:val="4A4A4A"/>
-          <w:sz w:val="20"/>
-        </w:rPr>
-        <w:t>Governo Federal democratiza o acesso ao Move Agricultura, destinando até R$ 10 bilhões em crédito para pessoas físicas e aquisição de máquinas agrícolas nacionais.</w:t>
-      </w:r>
-    </w:p>
-    <w:p>
-      <w:pPr>
-        <w:spacing w:after="40"/>
-      </w:pPr>
-      <w:r>
-        <w:rPr>
-          <w:b/>
-          <w:color w:val="888888"/>
-          <w:sz w:val="18"/>
-        </w:rPr>
-        <w:t xml:space="preserve">Publicado: </w:t>
-      </w:r>
-      <w:r>
-        <w:rPr>
-          <w:color w:val="888888"/>
-          <w:sz w:val="18"/>
-        </w:rPr>
-        <w:t xml:space="preserve">2026-07-02   </w:t>
-      </w:r>
-      <w:hyperlink r:id="rId51">
-        <w:r>
-          <w:rPr>
-            <w:color w:val="1A4D2E"/>
-            <w:u w:val="single"/>
-            <w:b/>
-          </w:rPr>
-          <w:t>Acessar materia</w:t>
-        </w:r>
-      </w:hyperlink>
-    </w:p>
-    <w:p>
-      <w:pPr>
-        <w:spacing w:after="120"/>
-      </w:pPr>
-      <w:r>
-        <w:rPr>
-          <w:i/>
-          <w:color w:val="888888"/>
-          <w:sz w:val="16"/>
-        </w:rPr>
-        <w:t>Medida provisória e linha de financiamento com grande impacto para o setor agrícola e produtores rurais.</w:t>
-      </w:r>
-    </w:p>
-    <w:p>
-      <w:pPr>
-        <w:spacing w:before="160" w:after="40"/>
-      </w:pPr>
-      <w:r>
-        <w:rPr>
-          <w:b/>
-          <w:color w:val="1A1A1A"/>
-          <w:sz w:val="22"/>
-        </w:rPr>
-        <w:t xml:space="preserve">Irrigantes e aquicultores terão mais flexibilidade para acessar desconto na conta de luz   </w:t>
-      </w:r>
-      <w:r>
-        <w:rPr>
-          <w:b/>
-          <w:color w:val="C0392B"/>
-          <w:sz w:val="16"/>
-        </w:rPr>
-        <w:t>[ALTA]</w:t>
-      </w:r>
-    </w:p>
-    <w:p>
-      <w:pPr>
-        <w:spacing w:after="40"/>
-      </w:pPr>
-      <w:r>
-        <w:rPr>
-          <w:color w:val="4A4A4A"/>
-          <w:sz w:val="20"/>
-        </w:rPr>
-        <w:t>Nova regulamentação concede mais flexibilidade para irrigantes e aquicultores acessarem desconto na conta de luz, ampliando a autonomia na definição de horários de uso do benefício.</w:t>
-      </w:r>
-    </w:p>
-    <w:p>
-      <w:pPr>
-        <w:spacing w:after="40"/>
-      </w:pPr>
-      <w:r>
-        <w:rPr>
-          <w:b/>
-          <w:color w:val="888888"/>
-          <w:sz w:val="18"/>
-        </w:rPr>
-        <w:t xml:space="preserve">Publicado: </w:t>
-      </w:r>
-      <w:r>
-        <w:rPr>
-          <w:color w:val="888888"/>
-          <w:sz w:val="18"/>
-        </w:rPr>
-        <w:t xml:space="preserve">2026-07-02   </w:t>
-      </w:r>
-      <w:hyperlink r:id="rId52">
-        <w:r>
-          <w:rPr>
-            <w:color w:val="1A4D2E"/>
-            <w:u w:val="single"/>
-            <w:b/>
-          </w:rPr>
-          <w:t>Acessar materia</w:t>
-        </w:r>
-      </w:hyperlink>
-    </w:p>
-    <w:p>
-      <w:pPr>
-        <w:spacing w:after="120"/>
-      </w:pPr>
-      <w:r>
-        <w:rPr>
-          <w:i/>
-          <w:color w:val="888888"/>
-          <w:sz w:val="16"/>
-        </w:rPr>
-        <w:t>Nova regulamentação que impacta diretamente os custos de energia para produtores rurais, com benefício econômico.</w:t>
-      </w:r>
-    </w:p>
-    <w:p>
-      <w:pPr>
-        <w:spacing w:before="160" w:after="40"/>
-      </w:pPr>
-      <w:r>
-        <w:rPr>
-          <w:b/>
-          <w:color w:val="1A1A1A"/>
-          <w:sz w:val="22"/>
-        </w:rPr>
-        <w:t xml:space="preserve">Ministro André de Paula participa de entrega de máquinas e equipamentos do Promaq na Paraíba   </w:t>
-      </w:r>
-      <w:r>
-        <w:rPr>
-          <w:b/>
-          <w:color w:val="D68910"/>
-          <w:sz w:val="16"/>
-        </w:rPr>
-        <w:t>[MÉDIA]</w:t>
-      </w:r>
-    </w:p>
-    <w:p>
-      <w:pPr>
-        <w:spacing w:after="40"/>
-      </w:pPr>
-      <w:r>
-        <w:rPr>
-          <w:color w:val="4A4A4A"/>
-          <w:sz w:val="20"/>
-        </w:rPr>
-        <w:t>Ministro André de Paula participa da entrega de 89 máquinas e equipamentos do Promaq, beneficiando 66 municípios paraibanos e impulsionando o desenvolvimento regional.</w:t>
-      </w:r>
-    </w:p>
-    <w:p>
-      <w:pPr>
-        <w:spacing w:after="40"/>
-      </w:pPr>
-      <w:r>
-        <w:rPr>
-          <w:b/>
-          <w:color w:val="888888"/>
-          <w:sz w:val="18"/>
-        </w:rPr>
-        <w:t xml:space="preserve">Publicado: </w:t>
-      </w:r>
-      <w:r>
-        <w:rPr>
-          <w:color w:val="888888"/>
-          <w:sz w:val="18"/>
-        </w:rPr>
-        <w:t xml:space="preserve">2026-07-02   </w:t>
-      </w:r>
-      <w:hyperlink r:id="rId53">
-        <w:r>
-          <w:rPr>
-            <w:color w:val="1A4D2E"/>
-            <w:u w:val="single"/>
-            <w:b/>
-          </w:rPr>
-          <w:t>Acessar materia</w:t>
-        </w:r>
-      </w:hyperlink>
-    </w:p>
-    <w:p>
-      <w:pPr>
-        <w:spacing w:after="120"/>
-      </w:pPr>
-      <w:r>
-        <w:rPr>
-          <w:i/>
-          <w:color w:val="888888"/>
-          <w:sz w:val="16"/>
-        </w:rPr>
-        <w:t>Entrega de equipamentos de programa governamental, com impacto regional no setor agrícola.</w:t>
+        <w:t>Notícia institucional genérica sobre adequação a período eleitoral.</w:t>
       </w:r>
     </w:p>
     <w:p/>
@@ -4331,7 +3744,7 @@
           <w:color w:val="4A4A4A"/>
           <w:sz w:val="18"/>
         </w:rPr>
-        <w:t>ANP | Notícias - Nenhuma publicação encontrada na janela temporal de 2026-07-02T00:00 a 2026-07-03T09:57.</w:t>
+        <w:t>ANPD | Notícias - Nenhum resultado foi encontrado na janela temporal.</w:t>
       </w:r>
     </w:p>
     <w:p>
@@ -4343,7 +3756,7 @@
           <w:color w:val="4A4A4A"/>
           <w:sz w:val="18"/>
         </w:rPr>
-        <w:t>ONS | Notícias - A fonte explicitamente indica 'Nenhum item encontrado' para o período.</w:t>
+        <w:t>Secretaria de Prêmios e Apostas | Notícias - Nenhum resultado foi encontrado na janela temporal.</w:t>
       </w:r>
     </w:p>
     <w:p>
@@ -4355,7 +3768,7 @@
           <w:color w:val="4A4A4A"/>
           <w:sz w:val="18"/>
         </w:rPr>
-        <w:t>Secretaria de Prêmios e Apostas | Notícias - Nenhuma publicação encontrada na janela temporal de 2026-07-02T00:00 a 2026-07-03T09:57.</w:t>
+        <w:t>INPI | Notícias - Nenhuma publicação encontrada na janela temporal.</w:t>
       </w:r>
     </w:p>
     <w:p>
@@ -4377,7 +3790,7 @@
           <w:color w:val="4A4A4A"/>
           <w:sz w:val="18"/>
         </w:rPr>
-        <w:t>Destaques do D.O.U. - A fonte é uma interface de busca e não lista notícias ou atos diretamente para extração de itens.</w:t>
+        <w:t>Receita Federal | Normas - Página de busca, sem conteúdo direto ou resultados identificáveis na janela.</w:t>
       </w:r>
     </w:p>
     <w:p>
@@ -4389,7 +3802,7 @@
           <w:color w:val="4A4A4A"/>
           <w:sz w:val="18"/>
         </w:rPr>
-        <w:t>Receita Federal | Normas - A fonte é uma interface de busca e não lista normas diretamente para extração de itens.</w:t>
+        <w:t>CGU | Notícias - Conteúdo restrito, requer autenticação para visualização.</w:t>
       </w:r>
     </w:p>
     <w:p>
@@ -4401,7 +3814,41 @@
           <w:color w:val="4A4A4A"/>
           <w:sz w:val="18"/>
         </w:rPr>
-        <w:t>COAF | Notícias - A fonte exibe 'Carregando' e não apresenta notícias para extração de itens.</w:t>
+        <w:t>Ministério do Meio Ambiente | Notícias - Conteúdo restrito, requer autenticação para visualização.</w:t>
+      </w:r>
+    </w:p>
+    <w:p>
+      <w:pPr>
+        <w:pStyle w:val="ListBullet"/>
+      </w:pPr>
+      <w:r>
+        <w:rPr>
+          <w:color w:val="4A4A4A"/>
+          <w:sz w:val="18"/>
+        </w:rPr>
+        <w:t>SENACON | Notícias - Conteúdo restrito, requer autenticação para visualização.</w:t>
+      </w:r>
+    </w:p>
+    <w:p>
+      <w:r>
+        <w:rPr>
+          <w:b/>
+          <w:color w:val="C0392B"/>
+          <w:sz w:val="20"/>
+        </w:rPr>
+        <w:t>Fontes com erro tecnico:</w:t>
+      </w:r>
+    </w:p>
+    <w:p>
+      <w:pPr>
+        <w:pStyle w:val="ListBullet"/>
+      </w:pPr>
+      <w:r>
+        <w:rPr>
+          <w:color w:val="4A4A4A"/>
+          <w:sz w:val="18"/>
+        </w:rPr>
+        <w:t>Destaques do D.O.U. - Conteudo muito curto (15 chars) - pagina possivelmente vazia, fora do ar ou bloqueando scraping</w:t>
       </w:r>
     </w:p>
     <w:p/>
@@ -4449,7 +3896,7 @@
           <w:color w:val="888888"/>
           <w:sz w:val="16"/>
         </w:rPr>
-        <w:t>Janela analisada: 2026-07-02T00:00 ate 2026-07-03T09:57</w:t>
+        <w:t>Janela analisada: 2026-07-03T00:00 ate 2026-07-06T11:28</w:t>
       </w:r>
     </w:p>
     <w:sectPr>

</xml_diff>